<commit_message>
Increased font size of chart titles
</commit_message>
<xml_diff>
--- a/docs/HEdClass Report.docx
+++ b/docs/HEdClass Report.docx
@@ -13,7 +13,6 @@
           <w:szCs w:val="30"/>
         </w:rPr>
       </w:pPr>
-      <w:proofErr w:type="spellStart"/>
       <w:r>
         <w:rPr>
           <w:b/>
@@ -21,17 +20,7 @@
           <w:sz w:val="30"/>
           <w:szCs w:val="30"/>
         </w:rPr>
-        <w:t>HEdClass</w:t>
-      </w:r>
-      <w:proofErr w:type="spellEnd"/>
-      <w:r>
-        <w:rPr>
-          <w:b/>
-          <w:bCs/>
-          <w:sz w:val="30"/>
-          <w:szCs w:val="30"/>
-        </w:rPr>
-        <w:t xml:space="preserve"> Report</w:t>
+        <w:t>HEdClass Report</w:t>
       </w:r>
     </w:p>
     <w:p>
@@ -52,6 +41,75 @@
           <w:szCs w:val="26"/>
         </w:rPr>
         <w:t>System Overview</w:t>
+      </w:r>
+    </w:p>
+    <w:p>
+      <w:pPr>
+        <w:ind w:left="0"/>
+        <w:rPr>
+          <w:sz w:val="24"/>
+          <w:szCs w:val="24"/>
+        </w:rPr>
+      </w:pPr>
+      <w:r>
+        <w:rPr>
+          <w:sz w:val="24"/>
+          <w:szCs w:val="24"/>
+        </w:rPr>
+        <w:t>HEdClass is a web app that offers an undergraduate classification platform for higher education institutes, aiming to solve</w:t>
+      </w:r>
+      <w:r>
+        <w:rPr>
+          <w:sz w:val="24"/>
+          <w:szCs w:val="24"/>
+        </w:rPr>
+        <w:t xml:space="preserve"> the operational risks created by manual student classification</w:t>
+      </w:r>
+      <w:r>
+        <w:rPr>
+          <w:sz w:val="24"/>
+          <w:szCs w:val="24"/>
+        </w:rPr>
+        <w:t xml:space="preserve">. </w:t>
+      </w:r>
+    </w:p>
+    <w:p>
+      <w:pPr>
+        <w:ind w:left="0"/>
+        <w:rPr>
+          <w:sz w:val="24"/>
+          <w:szCs w:val="24"/>
+        </w:rPr>
+      </w:pPr>
+    </w:p>
+    <w:p>
+      <w:pPr>
+        <w:ind w:left="0"/>
+        <w:rPr>
+          <w:sz w:val="24"/>
+          <w:szCs w:val="24"/>
+        </w:rPr>
+      </w:pPr>
+      <w:r>
+        <w:rPr>
+          <w:sz w:val="24"/>
+          <w:szCs w:val="24"/>
+        </w:rPr>
+        <w:t xml:space="preserve">The app consists of two actors, with the primary being classification officers that </w:t>
+      </w:r>
+      <w:r>
+        <w:rPr>
+          <w:sz w:val="24"/>
+          <w:szCs w:val="24"/>
+        </w:rPr>
+        <w:t>oversee</w:t>
+      </w:r>
+      <w:r>
+        <w:rPr>
+          <w:sz w:val="24"/>
+          <w:szCs w:val="24"/>
+        </w:rPr>
+        <w:t xml:space="preserve"> managing students within their assigned programmes for classification, and the secondary being an admin that is responsible for managing the classification officers.</w:t>
       </w:r>
     </w:p>
     <w:p>
@@ -381,7 +439,7 @@
       <w:tr>
         <w:tc>
           <w:tcPr>
-            <w:tcW w:w="3006" w:type="dxa"/>
+            <w:tcW w:w="3004" w:type="dxa"/>
           </w:tcPr>
           <w:p>
             <w:pPr>
@@ -423,7 +481,7 @@
         </w:tc>
         <w:tc>
           <w:tcPr>
-            <w:tcW w:w="3007" w:type="dxa"/>
+            <w:tcW w:w="3006" w:type="dxa"/>
           </w:tcPr>
           <w:p>
             <w:pPr>
@@ -446,7 +504,7 @@
       <w:tr>
         <w:tc>
           <w:tcPr>
-            <w:tcW w:w="3006" w:type="dxa"/>
+            <w:tcW w:w="3004" w:type="dxa"/>
           </w:tcPr>
           <w:p>
             <w:pPr>
@@ -462,6 +520,13 @@
                 <w:bCs/>
               </w:rPr>
               <w:t>Classification Officer</w:t>
+            </w:r>
+            <w:r>
+              <w:rPr>
+                <w:b/>
+                <w:bCs/>
+              </w:rPr>
+              <w:t xml:space="preserve"> (1)</w:t>
             </w:r>
           </w:p>
         </w:tc>
@@ -485,7 +550,7 @@
         </w:tc>
         <w:tc>
           <w:tcPr>
-            <w:tcW w:w="3007" w:type="dxa"/>
+            <w:tcW w:w="3006" w:type="dxa"/>
           </w:tcPr>
           <w:p>
             <w:pPr>
@@ -500,7 +565,80 @@
       <w:tr>
         <w:tc>
           <w:tcPr>
+            <w:tcW w:w="3004" w:type="dxa"/>
+          </w:tcPr>
+          <w:p>
+            <w:pPr>
+              <w:ind w:left="0"/>
+              <w:rPr>
+                <w:b/>
+                <w:bCs/>
+              </w:rPr>
+            </w:pPr>
+            <w:r>
+              <w:rPr>
+                <w:b/>
+                <w:bCs/>
+              </w:rPr>
+              <w:t>Classification Officer</w:t>
+            </w:r>
+            <w:r>
+              <w:rPr>
+                <w:b/>
+                <w:bCs/>
+              </w:rPr>
+              <w:t xml:space="preserve"> (2)</w:t>
+            </w:r>
+          </w:p>
+        </w:tc>
+        <w:tc>
+          <w:tcPr>
             <w:tcW w:w="3006" w:type="dxa"/>
+          </w:tcPr>
+          <w:p>
+            <w:pPr>
+              <w:ind w:left="0"/>
+            </w:pPr>
+            <w:hyperlink r:id="rId9" w:history="1">
+              <w:r>
+                <w:rPr>
+                  <w:rStyle w:val="Hyperlink"/>
+                </w:rPr>
+                <w:t>officer</w:t>
+              </w:r>
+              <w:r>
+                <w:rPr>
+                  <w:rStyle w:val="Hyperlink"/>
+                </w:rPr>
+                <w:t>2</w:t>
+              </w:r>
+              <w:r>
+                <w:rPr>
+                  <w:rStyle w:val="Hyperlink"/>
+                </w:rPr>
+                <w:t>@hedclass.com</w:t>
+              </w:r>
+            </w:hyperlink>
+          </w:p>
+        </w:tc>
+        <w:tc>
+          <w:tcPr>
+            <w:tcW w:w="3006" w:type="dxa"/>
+          </w:tcPr>
+          <w:p>
+            <w:pPr>
+              <w:ind w:left="0"/>
+            </w:pPr>
+            <w:r>
+              <w:t>password123</w:t>
+            </w:r>
+          </w:p>
+        </w:tc>
+      </w:tr>
+      <w:tr>
+        <w:tc>
+          <w:tcPr>
+            <w:tcW w:w="3004" w:type="dxa"/>
           </w:tcPr>
           <w:p>
             <w:pPr>
@@ -527,7 +665,7 @@
             <w:pPr>
               <w:ind w:left="0"/>
             </w:pPr>
-            <w:hyperlink r:id="rId9" w:history="1">
+            <w:hyperlink r:id="rId10" w:history="1">
               <w:r>
                 <w:rPr>
                   <w:rStyle w:val="Hyperlink"/>
@@ -539,7 +677,7 @@
         </w:tc>
         <w:tc>
           <w:tcPr>
-            <w:tcW w:w="3007" w:type="dxa"/>
+            <w:tcW w:w="3006" w:type="dxa"/>
           </w:tcPr>
           <w:p>
             <w:pPr>
@@ -562,6 +700,7 @@
     </w:p>
     <w:p>
       <w:pPr>
+        <w:spacing w:after="160" w:line="278" w:lineRule="auto"/>
         <w:ind w:left="0"/>
         <w:rPr>
           <w:b/>
@@ -577,6 +716,27 @@
           <w:sz w:val="26"/>
           <w:szCs w:val="26"/>
         </w:rPr>
+        <w:br w:type="page"/>
+      </w:r>
+    </w:p>
+    <w:p>
+      <w:pPr>
+        <w:ind w:left="0"/>
+        <w:rPr>
+          <w:b/>
+          <w:bCs/>
+          <w:sz w:val="26"/>
+          <w:szCs w:val="26"/>
+        </w:rPr>
+      </w:pPr>
+      <w:r>
+        <w:rPr>
+          <w:b/>
+          <w:bCs/>
+          <w:sz w:val="26"/>
+          <w:szCs w:val="26"/>
+        </w:rPr>
+        <w:lastRenderedPageBreak/>
         <w:t>Implemented Functions</w:t>
       </w:r>
     </w:p>
@@ -602,7 +762,7 @@
         <mc:AlternateContent>
           <mc:Choice Requires="wpg">
             <w:drawing>
-              <wp:anchor distT="0" distB="0" distL="114300" distR="114300" simplePos="0" relativeHeight="251657216" behindDoc="1" locked="0" layoutInCell="1" allowOverlap="1" wp14:anchorId="1FB066A0" wp14:editId="50080188">
+              <wp:anchor distT="0" distB="0" distL="114300" distR="114300" simplePos="0" relativeHeight="251651072" behindDoc="1" locked="0" layoutInCell="1" allowOverlap="1" wp14:anchorId="1FB066A0" wp14:editId="5A7F4118">
                 <wp:simplePos x="0" y="0"/>
                 <wp:positionH relativeFrom="column">
                   <wp:posOffset>0</wp:posOffset>
@@ -612,17 +772,7 @@
                 </wp:positionV>
                 <wp:extent cx="5731510" cy="2761615"/>
                 <wp:effectExtent l="0" t="0" r="2540" b="635"/>
-                <wp:wrapTight wrapText="bothSides">
-                  <wp:wrapPolygon edited="0">
-                    <wp:start x="0" y="0"/>
-                    <wp:lineTo x="0" y="19370"/>
-                    <wp:lineTo x="215" y="21456"/>
-                    <wp:lineTo x="21322" y="21456"/>
-                    <wp:lineTo x="21538" y="19370"/>
-                    <wp:lineTo x="21538" y="0"/>
-                    <wp:lineTo x="0" y="0"/>
-                  </wp:wrapPolygon>
-                </wp:wrapTight>
+                <wp:wrapTopAndBottom/>
                 <wp:docPr id="492452188" name="Group 1"/>
                 <wp:cNvGraphicFramePr/>
                 <a:graphic xmlns:a="http://schemas.openxmlformats.org/drawingml/2006/main">
@@ -645,7 +795,7 @@
                           </pic:cNvPicPr>
                         </pic:nvPicPr>
                         <pic:blipFill>
-                          <a:blip r:embed="rId10" cstate="print">
+                          <a:blip r:embed="rId11" cstate="print">
                             <a:extLst>
                               <a:ext uri="{28A0092B-C50C-407E-A947-70E740481C1C}">
                                 <a14:useLocalDpi xmlns:a14="http://schemas.microsoft.com/office/drawing/2010/main" val="0"/>
@@ -729,7 +879,7 @@
           </mc:Choice>
           <mc:Fallback>
             <w:pict>
-              <v:group w14:anchorId="1FB066A0" id="Group 1" o:spid="_x0000_s1026" style="position:absolute;margin-left:0;margin-top:15.8pt;width:451.3pt;height:217.45pt;z-index:-251659264" coordsize="57315,27616" o:gfxdata="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">
+              <v:group w14:anchorId="1FB066A0" id="Group 1" o:spid="_x0000_s1026" style="position:absolute;margin-left:0;margin-top:15.8pt;width:451.3pt;height:217.45pt;z-index:-251665408" coordsize="57315,27616" o:gfxdata="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">
                 <v:shapetype id="_x0000_t75" coordsize="21600,21600" o:spt="75" o:preferrelative="t" path="m@4@5l@4@11@9@11@9@5xe" filled="f" stroked="f">
                   <v:stroke joinstyle="miter"/>
                   <v:formulas>
@@ -750,7 +900,7 @@
                   <o:lock v:ext="edit" aspectratio="t"/>
                 </v:shapetype>
                 <v:shape id="Picture 1" o:spid="_x0000_s1027" type="#_x0000_t75" style="position:absolute;width:57315;height:24726;visibility:visible;mso-wrap-style:square" o:gfxdata="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">
-                  <v:imagedata r:id="rId11" o:title=""/>
+                  <v:imagedata r:id="rId12" o:title=""/>
                 </v:shape>
                 <v:shapetype id="_x0000_t202" coordsize="21600,21600" o:spt="202" path="m,l,21600r21600,l21600,xe">
                   <v:stroke joinstyle="miter"/>
@@ -788,7 +938,7 @@
                     </w:txbxContent>
                   </v:textbox>
                 </v:shape>
-                <w10:wrap type="tight"/>
+                <w10:wrap type="topAndBottom"/>
               </v:group>
             </w:pict>
           </mc:Fallback>
@@ -808,8 +958,284 @@
       <w:pPr>
         <w:ind w:left="0"/>
         <w:rPr>
-          <w:i/>
-          <w:iCs/>
+          <w:sz w:val="24"/>
+          <w:szCs w:val="24"/>
+        </w:rPr>
+      </w:pPr>
+      <w:r>
+        <w:rPr>
+          <w:sz w:val="24"/>
+          <w:szCs w:val="24"/>
+        </w:rPr>
+        <w:t>Login page allows user to enter their credentials and password, satisfying requirement A1.</w:t>
+      </w:r>
+    </w:p>
+    <w:p>
+      <w:pPr>
+        <w:ind w:left="0"/>
+        <w:rPr>
+          <w:sz w:val="24"/>
+          <w:szCs w:val="24"/>
+        </w:rPr>
+      </w:pPr>
+    </w:p>
+    <w:p>
+      <w:pPr>
+        <w:ind w:left="0"/>
+        <w:rPr>
+          <w:sz w:val="24"/>
+          <w:szCs w:val="24"/>
+        </w:rPr>
+      </w:pPr>
+      <w:r>
+        <w:rPr>
+          <w:noProof/>
+          <w:sz w:val="24"/>
+          <w:szCs w:val="24"/>
+          <w14:ligatures w14:val="standardContextual"/>
+        </w:rPr>
+        <mc:AlternateContent>
+          <mc:Choice Requires="wpg">
+            <w:drawing>
+              <wp:anchor distT="0" distB="0" distL="114300" distR="114300" simplePos="0" relativeHeight="251687936" behindDoc="1" locked="0" layoutInCell="1" allowOverlap="1" wp14:anchorId="418D2236" wp14:editId="37C10746">
+                <wp:simplePos x="0" y="0"/>
+                <wp:positionH relativeFrom="column">
+                  <wp:posOffset>-175260</wp:posOffset>
+                </wp:positionH>
+                <wp:positionV relativeFrom="paragraph">
+                  <wp:posOffset>523240</wp:posOffset>
+                </wp:positionV>
+                <wp:extent cx="6014720" cy="3150235"/>
+                <wp:effectExtent l="0" t="0" r="5080" b="0"/>
+                <wp:wrapTopAndBottom/>
+                <wp:docPr id="310050958" name="Group 11"/>
+                <wp:cNvGraphicFramePr/>
+                <a:graphic xmlns:a="http://schemas.openxmlformats.org/drawingml/2006/main">
+                  <a:graphicData uri="http://schemas.microsoft.com/office/word/2010/wordprocessingGroup">
+                    <wpg:wgp>
+                      <wpg:cNvGrpSpPr/>
+                      <wpg:grpSpPr>
+                        <a:xfrm>
+                          <a:off x="0" y="0"/>
+                          <a:ext cx="6014720" cy="3150235"/>
+                          <a:chOff x="0" y="0"/>
+                          <a:chExt cx="6014720" cy="3150235"/>
+                        </a:xfrm>
+                      </wpg:grpSpPr>
+                      <pic:pic xmlns:pic="http://schemas.openxmlformats.org/drawingml/2006/picture">
+                        <pic:nvPicPr>
+                          <pic:cNvPr id="863089793" name="Picture 1"/>
+                          <pic:cNvPicPr>
+                            <a:picLocks noChangeAspect="1"/>
+                          </pic:cNvPicPr>
+                        </pic:nvPicPr>
+                        <pic:blipFill>
+                          <a:blip r:embed="rId13" cstate="print">
+                            <a:extLst>
+                              <a:ext uri="{28A0092B-C50C-407E-A947-70E740481C1C}">
+                                <a14:useLocalDpi xmlns:a14="http://schemas.microsoft.com/office/drawing/2010/main" val="0"/>
+                              </a:ext>
+                            </a:extLst>
+                          </a:blip>
+                          <a:stretch>
+                            <a:fillRect/>
+                          </a:stretch>
+                        </pic:blipFill>
+                        <pic:spPr>
+                          <a:xfrm>
+                            <a:off x="22860" y="0"/>
+                            <a:ext cx="5991860" cy="2872740"/>
+                          </a:xfrm>
+                          <a:prstGeom prst="rect">
+                            <a:avLst/>
+                          </a:prstGeom>
+                        </pic:spPr>
+                      </pic:pic>
+                      <wps:wsp>
+                        <wps:cNvPr id="75900723" name="Text Box 2"/>
+                        <wps:cNvSpPr txBox="1">
+                          <a:spLocks noChangeArrowheads="1"/>
+                        </wps:cNvSpPr>
+                        <wps:spPr bwMode="auto">
+                          <a:xfrm>
+                            <a:off x="0" y="2865120"/>
+                            <a:ext cx="5996940" cy="285115"/>
+                          </a:xfrm>
+                          <a:prstGeom prst="rect">
+                            <a:avLst/>
+                          </a:prstGeom>
+                          <a:noFill/>
+                          <a:ln w="9525">
+                            <a:noFill/>
+                            <a:miter lim="800000"/>
+                            <a:headEnd/>
+                            <a:tailEnd/>
+                          </a:ln>
+                        </wps:spPr>
+                        <wps:txbx>
+                          <w:txbxContent>
+                            <w:p>
+                              <w:pPr>
+                                <w:ind w:left="0"/>
+                                <w:rPr>
+                                  <w:i/>
+                                  <w:iCs/>
+                                </w:rPr>
+                              </w:pPr>
+                              <w:r>
+                                <w:rPr>
+                                  <w:b/>
+                                  <w:bCs/>
+                                </w:rPr>
+                                <w:t xml:space="preserve">Figure </w:t>
+                              </w:r>
+                              <w:r>
+                                <w:rPr>
+                                  <w:b/>
+                                  <w:bCs/>
+                                </w:rPr>
+                                <w:t>2</w:t>
+                              </w:r>
+                              <w:r>
+                                <w:rPr>
+                                  <w:b/>
+                                  <w:bCs/>
+                                </w:rPr>
+                                <w:t xml:space="preserve">. </w:t>
+                              </w:r>
+                              <w:r>
+                                <w:t>A</w:t>
+                              </w:r>
+                              <w:r>
+                                <w:t>uthentication middleware for role-based access</w:t>
+                              </w:r>
+                              <w:r>
+                                <w:t xml:space="preserve"> </w:t>
+                              </w:r>
+                            </w:p>
+                          </w:txbxContent>
+                        </wps:txbx>
+                        <wps:bodyPr rot="0" vert="horz" wrap="square" lIns="91440" tIns="45720" rIns="91440" bIns="45720" anchor="t" anchorCtr="0">
+                          <a:spAutoFit/>
+                        </wps:bodyPr>
+                      </wps:wsp>
+                    </wpg:wgp>
+                  </a:graphicData>
+                </a:graphic>
+              </wp:anchor>
+            </w:drawing>
+          </mc:Choice>
+          <mc:Fallback>
+            <w:pict>
+              <v:group w14:anchorId="418D2236" id="Group 11" o:spid="_x0000_s1029" style="position:absolute;margin-left:-13.8pt;margin-top:41.2pt;width:473.6pt;height:248.05pt;z-index:-251628544" coordsize="60147,31502" o:gfxdata="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">
+                <v:shape id="Picture 1" o:spid="_x0000_s1030" type="#_x0000_t75" style="position:absolute;left:228;width:59919;height:28727;visibility:visible;mso-wrap-style:square" o:gfxdata="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">
+                  <v:imagedata r:id="rId14" o:title=""/>
+                </v:shape>
+                <v:shape id="_x0000_s1031" type="#_x0000_t202" style="position:absolute;top:28651;width:59969;height:2851;visibility:visible;mso-wrap-style:square;v-text-anchor:top" o:gfxdata="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" filled="f" stroked="f">
+                  <v:textbox style="mso-fit-shape-to-text:t">
+                    <w:txbxContent>
+                      <w:p>
+                        <w:pPr>
+                          <w:ind w:left="0"/>
+                          <w:rPr>
+                            <w:i/>
+                            <w:iCs/>
+                          </w:rPr>
+                        </w:pPr>
+                        <w:r>
+                          <w:rPr>
+                            <w:b/>
+                            <w:bCs/>
+                          </w:rPr>
+                          <w:t xml:space="preserve">Figure </w:t>
+                        </w:r>
+                        <w:r>
+                          <w:rPr>
+                            <w:b/>
+                            <w:bCs/>
+                          </w:rPr>
+                          <w:t>2</w:t>
+                        </w:r>
+                        <w:r>
+                          <w:rPr>
+                            <w:b/>
+                            <w:bCs/>
+                          </w:rPr>
+                          <w:t xml:space="preserve">. </w:t>
+                        </w:r>
+                        <w:r>
+                          <w:t>A</w:t>
+                        </w:r>
+                        <w:r>
+                          <w:t>uthentication middleware for role-based access</w:t>
+                        </w:r>
+                        <w:r>
+                          <w:t xml:space="preserve"> </w:t>
+                        </w:r>
+                      </w:p>
+                    </w:txbxContent>
+                  </v:textbox>
+                </v:shape>
+                <w10:wrap type="topAndBottom"/>
+              </v:group>
+            </w:pict>
+          </mc:Fallback>
+        </mc:AlternateContent>
+      </w:r>
+      <w:r>
+        <w:rPr>
+          <w:sz w:val="24"/>
+          <w:szCs w:val="24"/>
+        </w:rPr>
+        <w:t>Based on credentials entered, system will display role-specific pages</w:t>
+      </w:r>
+      <w:r>
+        <w:rPr>
+          <w:sz w:val="24"/>
+          <w:szCs w:val="24"/>
+        </w:rPr>
+        <w:t xml:space="preserve"> by using authentication middleware</w:t>
+      </w:r>
+      <w:r>
+        <w:rPr>
+          <w:sz w:val="24"/>
+          <w:szCs w:val="24"/>
+        </w:rPr>
+        <w:t xml:space="preserve">, as shown in Figure </w:t>
+      </w:r>
+      <w:r>
+        <w:rPr>
+          <w:sz w:val="24"/>
+          <w:szCs w:val="24"/>
+        </w:rPr>
+        <w:t>2</w:t>
+      </w:r>
+      <w:r>
+        <w:rPr>
+          <w:sz w:val="24"/>
+          <w:szCs w:val="24"/>
+        </w:rPr>
+        <w:t xml:space="preserve"> (satisfying </w:t>
+      </w:r>
+      <w:r>
+        <w:rPr>
+          <w:sz w:val="24"/>
+          <w:szCs w:val="24"/>
+        </w:rPr>
+        <w:t xml:space="preserve">requirement </w:t>
+      </w:r>
+      <w:r>
+        <w:rPr>
+          <w:sz w:val="24"/>
+          <w:szCs w:val="24"/>
+        </w:rPr>
+        <w:t>A3).</w:t>
+      </w:r>
+    </w:p>
+    <w:p>
+      <w:pPr>
+        <w:ind w:left="0"/>
+        <w:rPr>
           <w:sz w:val="24"/>
           <w:szCs w:val="24"/>
         </w:rPr>
@@ -838,27 +1264,17 @@
         <mc:AlternateContent>
           <mc:Choice Requires="wpg">
             <w:drawing>
-              <wp:anchor distT="0" distB="0" distL="114300" distR="114300" simplePos="0" relativeHeight="251661312" behindDoc="1" locked="0" layoutInCell="1" allowOverlap="1" wp14:anchorId="1CC27AE4" wp14:editId="27D9225D">
+              <wp:anchor distT="0" distB="0" distL="114300" distR="114300" simplePos="0" relativeHeight="251655168" behindDoc="1" locked="0" layoutInCell="1" allowOverlap="1" wp14:anchorId="1CC27AE4" wp14:editId="4B2AB32A">
                 <wp:simplePos x="0" y="0"/>
                 <wp:positionH relativeFrom="column">
                   <wp:posOffset>0</wp:posOffset>
                 </wp:positionH>
                 <wp:positionV relativeFrom="paragraph">
-                  <wp:posOffset>198120</wp:posOffset>
+                  <wp:posOffset>200660</wp:posOffset>
                 </wp:positionV>
                 <wp:extent cx="5731510" cy="3013075"/>
                 <wp:effectExtent l="0" t="0" r="2540" b="0"/>
-                <wp:wrapTight wrapText="bothSides">
-                  <wp:wrapPolygon edited="0">
-                    <wp:start x="0" y="0"/>
-                    <wp:lineTo x="0" y="19665"/>
-                    <wp:lineTo x="215" y="21441"/>
-                    <wp:lineTo x="21322" y="21441"/>
-                    <wp:lineTo x="21538" y="19665"/>
-                    <wp:lineTo x="21538" y="0"/>
-                    <wp:lineTo x="0" y="0"/>
-                  </wp:wrapPolygon>
-                </wp:wrapTight>
+                <wp:wrapTopAndBottom/>
                 <wp:docPr id="2011273124" name="Group 2"/>
                 <wp:cNvGraphicFramePr/>
                 <a:graphic xmlns:a="http://schemas.openxmlformats.org/drawingml/2006/main">
@@ -881,7 +1297,7 @@
                           </pic:cNvPicPr>
                         </pic:nvPicPr>
                         <pic:blipFill>
-                          <a:blip r:embed="rId12" cstate="print">
+                          <a:blip r:embed="rId15" cstate="print">
                             <a:extLst>
                               <a:ext uri="{28A0092B-C50C-407E-A947-70E740481C1C}">
                                 <a14:useLocalDpi xmlns:a14="http://schemas.microsoft.com/office/drawing/2010/main" val="0"/>
@@ -945,7 +1361,7 @@
                                   <w:b/>
                                   <w:bCs/>
                                 </w:rPr>
-                                <w:t>2</w:t>
+                                <w:t>3</w:t>
                               </w:r>
                               <w:r>
                                 <w:rPr>
@@ -955,31 +1371,14 @@
                                 <w:t xml:space="preserve">. </w:t>
                               </w:r>
                               <w:r>
-                                <w:t>Admin Dashboard</w:t>
-                              </w:r>
-                              <w:r>
-                                <w:t xml:space="preserve"> (</w:t>
+                                <w:t>Admin Dashboard (</w:t>
                               </w:r>
                               <w:r>
                                 <w:rPr>
                                   <w:i/>
                                   <w:iCs/>
                                 </w:rPr>
-                                <w:t>“/</w:t>
-                              </w:r>
-                              <w:r>
-                                <w:rPr>
-                                  <w:i/>
-                                  <w:iCs/>
-                                </w:rPr>
-                                <w:t>admin</w:t>
-                              </w:r>
-                              <w:r>
-                                <w:rPr>
-                                  <w:i/>
-                                  <w:iCs/>
-                                </w:rPr>
-                                <w:t>”)</w:t>
+                                <w:t>“/admin”)</w:t>
                               </w:r>
                             </w:p>
                           </w:txbxContent>
@@ -996,11 +1395,11 @@
           </mc:Choice>
           <mc:Fallback>
             <w:pict>
-              <v:group w14:anchorId="1CC27AE4" id="Group 2" o:spid="_x0000_s1029" style="position:absolute;margin-left:0;margin-top:15.6pt;width:451.3pt;height:237.25pt;z-index:-251655168" coordsize="57315,30130" o:gfxdata="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">
-                <v:shape id="Picture 1" o:spid="_x0000_s1030" type="#_x0000_t75" style="position:absolute;width:57315;height:27451;visibility:visible;mso-wrap-style:square" o:gfxdata="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">
-                  <v:imagedata r:id="rId13" o:title=""/>
+              <v:group w14:anchorId="1CC27AE4" id="Group 2" o:spid="_x0000_s1032" style="position:absolute;margin-left:0;margin-top:15.8pt;width:451.3pt;height:237.25pt;z-index:-251661312" coordsize="57315,30130" o:gfxdata="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">
+                <v:shape id="Picture 1" o:spid="_x0000_s1033" type="#_x0000_t75" style="position:absolute;width:57315;height:27451;visibility:visible;mso-wrap-style:square" o:gfxdata="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">
+                  <v:imagedata r:id="rId16" o:title=""/>
                 </v:shape>
-                <v:shape id="_x0000_s1031" type="#_x0000_t202" style="position:absolute;left:76;top:27279;width:57226;height:2851;visibility:visible;mso-wrap-style:square;v-text-anchor:top" o:gfxdata="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" filled="f" stroked="f">
+                <v:shape id="_x0000_s1034" type="#_x0000_t202" style="position:absolute;left:76;top:27279;width:57226;height:2851;visibility:visible;mso-wrap-style:square;v-text-anchor:top" o:gfxdata="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" filled="f" stroked="f">
                   <v:textbox style="mso-fit-shape-to-text:t">
                     <w:txbxContent>
                       <w:p>
@@ -1023,7 +1422,7 @@
                             <w:b/>
                             <w:bCs/>
                           </w:rPr>
-                          <w:t>2</w:t>
+                          <w:t>3</w:t>
                         </w:r>
                         <w:r>
                           <w:rPr>
@@ -1033,37 +1432,20 @@
                           <w:t xml:space="preserve">. </w:t>
                         </w:r>
                         <w:r>
-                          <w:t>Admin Dashboard</w:t>
-                        </w:r>
-                        <w:r>
-                          <w:t xml:space="preserve"> (</w:t>
+                          <w:t>Admin Dashboard (</w:t>
                         </w:r>
                         <w:r>
                           <w:rPr>
                             <w:i/>
                             <w:iCs/>
                           </w:rPr>
-                          <w:t>“/</w:t>
-                        </w:r>
-                        <w:r>
-                          <w:rPr>
-                            <w:i/>
-                            <w:iCs/>
-                          </w:rPr>
-                          <w:t>admin</w:t>
-                        </w:r>
-                        <w:r>
-                          <w:rPr>
-                            <w:i/>
-                            <w:iCs/>
-                          </w:rPr>
-                          <w:t>”)</w:t>
+                          <w:t>“/admin”)</w:t>
                         </w:r>
                       </w:p>
                     </w:txbxContent>
                   </v:textbox>
                 </v:shape>
-                <w10:wrap type="tight"/>
+                <w10:wrap type="topAndBottom"/>
               </v:group>
             </w:pict>
           </mc:Fallback>
@@ -1089,6 +1471,17 @@
           <w:szCs w:val="24"/>
         </w:rPr>
       </w:pPr>
+    </w:p>
+    <w:p>
+      <w:pPr>
+        <w:ind w:left="0"/>
+        <w:rPr>
+          <w:i/>
+          <w:iCs/>
+          <w:sz w:val="24"/>
+          <w:szCs w:val="24"/>
+        </w:rPr>
+      </w:pPr>
       <w:r>
         <w:rPr>
           <w:i/>
@@ -1101,32 +1494,17 @@
         <mc:AlternateContent>
           <mc:Choice Requires="wpg">
             <w:drawing>
-              <wp:anchor distT="0" distB="0" distL="114300" distR="114300" simplePos="0" relativeHeight="251665408" behindDoc="1" locked="0" layoutInCell="1" allowOverlap="1" wp14:anchorId="4D21C898" wp14:editId="4333733F">
+              <wp:anchor distT="0" distB="0" distL="114300" distR="114300" simplePos="0" relativeHeight="251659264" behindDoc="1" locked="0" layoutInCell="1" allowOverlap="1" wp14:anchorId="4D21C898" wp14:editId="3479D152">
                 <wp:simplePos x="0" y="0"/>
-                <wp:positionH relativeFrom="column">
-                  <wp:posOffset>0</wp:posOffset>
+                <wp:positionH relativeFrom="margin">
+                  <wp:align>right</wp:align>
                 </wp:positionH>
                 <wp:positionV relativeFrom="paragraph">
-                  <wp:posOffset>3357245</wp:posOffset>
+                  <wp:posOffset>246380</wp:posOffset>
                 </wp:positionV>
                 <wp:extent cx="5731510" cy="1870075"/>
                 <wp:effectExtent l="0" t="0" r="2540" b="0"/>
-                <wp:wrapTight wrapText="bothSides">
-                  <wp:wrapPolygon edited="0">
-                    <wp:start x="0" y="0"/>
-                    <wp:lineTo x="0" y="17603"/>
-                    <wp:lineTo x="10769" y="17603"/>
-                    <wp:lineTo x="215" y="18703"/>
-                    <wp:lineTo x="215" y="21343"/>
-                    <wp:lineTo x="21322" y="21343"/>
-                    <wp:lineTo x="21466" y="18923"/>
-                    <wp:lineTo x="20892" y="18703"/>
-                    <wp:lineTo x="10769" y="17603"/>
-                    <wp:lineTo x="21538" y="17603"/>
-                    <wp:lineTo x="21538" y="0"/>
-                    <wp:lineTo x="0" y="0"/>
-                  </wp:wrapPolygon>
-                </wp:wrapTight>
+                <wp:wrapTopAndBottom/>
                 <wp:docPr id="266627144" name="Group 3"/>
                 <wp:cNvGraphicFramePr/>
                 <a:graphic xmlns:a="http://schemas.openxmlformats.org/drawingml/2006/main">
@@ -1149,7 +1527,7 @@
                           </pic:cNvPicPr>
                         </pic:nvPicPr>
                         <pic:blipFill>
-                          <a:blip r:embed="rId14" cstate="print">
+                          <a:blip r:embed="rId17" cstate="print">
                             <a:extLst>
                               <a:ext uri="{28A0092B-C50C-407E-A947-70E740481C1C}">
                                 <a14:useLocalDpi xmlns:a14="http://schemas.microsoft.com/office/drawing/2010/main" val="0"/>
@@ -1213,7 +1591,7 @@
                                   <w:b/>
                                   <w:bCs/>
                                 </w:rPr>
-                                <w:t>3</w:t>
+                                <w:t>4</w:t>
                               </w:r>
                               <w:r>
                                 <w:rPr>
@@ -1223,31 +1601,14 @@
                                 <w:t xml:space="preserve">. </w:t>
                               </w:r>
                               <w:r>
-                                <w:t>Officer Management page</w:t>
-                              </w:r>
-                              <w:r>
-                                <w:t xml:space="preserve"> (</w:t>
+                                <w:t>Officer Management page (</w:t>
                               </w:r>
                               <w:r>
                                 <w:rPr>
                                   <w:i/>
                                   <w:iCs/>
                                 </w:rPr>
-                                <w:t>“/admin</w:t>
-                              </w:r>
-                              <w:r>
-                                <w:rPr>
-                                  <w:i/>
-                                  <w:iCs/>
-                                </w:rPr>
-                                <w:t>/officers</w:t>
-                              </w:r>
-                              <w:r>
-                                <w:rPr>
-                                  <w:i/>
-                                  <w:iCs/>
-                                </w:rPr>
-                                <w:t>”)</w:t>
+                                <w:t>“/admin/officers”)</w:t>
                               </w:r>
                             </w:p>
                           </w:txbxContent>
@@ -1259,16 +1620,22 @@
                     </wpg:wgp>
                   </a:graphicData>
                 </a:graphic>
+                <wp14:sizeRelH relativeFrom="margin">
+                  <wp14:pctWidth>0</wp14:pctWidth>
+                </wp14:sizeRelH>
+                <wp14:sizeRelV relativeFrom="margin">
+                  <wp14:pctHeight>0</wp14:pctHeight>
+                </wp14:sizeRelV>
               </wp:anchor>
             </w:drawing>
           </mc:Choice>
           <mc:Fallback>
             <w:pict>
-              <v:group w14:anchorId="4D21C898" id="Group 3" o:spid="_x0000_s1032" style="position:absolute;margin-left:0;margin-top:264.35pt;width:451.3pt;height:147.25pt;z-index:-251651072" coordsize="57315,18700" o:gfxdata="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">
-                <v:shape id="Picture 1" o:spid="_x0000_s1033" type="#_x0000_t75" style="position:absolute;width:57315;height:15328;visibility:visible;mso-wrap-style:square" o:gfxdata="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">
-                  <v:imagedata r:id="rId15" o:title=""/>
+              <v:group w14:anchorId="4D21C898" id="Group 3" o:spid="_x0000_s1035" style="position:absolute;margin-left:400.1pt;margin-top:19.4pt;width:451.3pt;height:147.25pt;z-index:-251657216;mso-position-horizontal:right;mso-position-horizontal-relative:margin;mso-width-relative:margin;mso-height-relative:margin" coordsize="57315,18700" o:gfxdata="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">
+                <v:shape id="Picture 1" o:spid="_x0000_s1036" type="#_x0000_t75" style="position:absolute;width:57315;height:15328;visibility:visible;mso-wrap-style:square" o:gfxdata="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">
+                  <v:imagedata r:id="rId18" o:title=""/>
                 </v:shape>
-                <v:shape id="_x0000_s1034" type="#_x0000_t202" style="position:absolute;top:15849;width:57226;height:2851;visibility:visible;mso-wrap-style:square;v-text-anchor:top" o:gfxdata="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" filled="f" stroked="f">
+                <v:shape id="_x0000_s1037" type="#_x0000_t202" style="position:absolute;top:15849;width:57226;height:2851;visibility:visible;mso-wrap-style:square;v-text-anchor:top" o:gfxdata="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" filled="f" stroked="f">
                   <v:textbox style="mso-fit-shape-to-text:t">
                     <w:txbxContent>
                       <w:p>
@@ -1291,7 +1658,7 @@
                             <w:b/>
                             <w:bCs/>
                           </w:rPr>
-                          <w:t>3</w:t>
+                          <w:t>4</w:t>
                         </w:r>
                         <w:r>
                           <w:rPr>
@@ -1301,37 +1668,20 @@
                           <w:t xml:space="preserve">. </w:t>
                         </w:r>
                         <w:r>
-                          <w:t>Officer Management page</w:t>
-                        </w:r>
-                        <w:r>
-                          <w:t xml:space="preserve"> (</w:t>
+                          <w:t>Officer Management page (</w:t>
                         </w:r>
                         <w:r>
                           <w:rPr>
                             <w:i/>
                             <w:iCs/>
                           </w:rPr>
-                          <w:t>“/admin</w:t>
-                        </w:r>
-                        <w:r>
-                          <w:rPr>
-                            <w:i/>
-                            <w:iCs/>
-                          </w:rPr>
-                          <w:t>/officers</w:t>
-                        </w:r>
-                        <w:r>
-                          <w:rPr>
-                            <w:i/>
-                            <w:iCs/>
-                          </w:rPr>
-                          <w:t>”)</w:t>
+                          <w:t>“/admin/officers”)</w:t>
                         </w:r>
                       </w:p>
                     </w:txbxContent>
                   </v:textbox>
                 </v:shape>
-                <w10:wrap type="tight"/>
+                <w10:wrap type="topAndBottom" anchorx="margin"/>
               </v:group>
             </w:pict>
           </mc:Fallback>
@@ -1351,6 +1701,327 @@
       <w:pPr>
         <w:ind w:left="0"/>
         <w:rPr>
+          <w:sz w:val="24"/>
+          <w:szCs w:val="24"/>
+        </w:rPr>
+      </w:pPr>
+      <w:r>
+        <w:rPr>
+          <w:sz w:val="24"/>
+          <w:szCs w:val="24"/>
+        </w:rPr>
+        <w:t xml:space="preserve">Figure 4 shows officer management page, allowing admin to edit, delete and add new officers, satisfying requirement B1. </w:t>
+      </w:r>
+    </w:p>
+    <w:p>
+      <w:pPr>
+        <w:ind w:left="0"/>
+        <w:rPr>
+          <w:sz w:val="24"/>
+          <w:szCs w:val="24"/>
+        </w:rPr>
+      </w:pPr>
+    </w:p>
+    <w:p>
+      <w:pPr>
+        <w:ind w:left="0"/>
+        <w:rPr>
+          <w:sz w:val="24"/>
+          <w:szCs w:val="24"/>
+        </w:rPr>
+      </w:pPr>
+      <w:r>
+        <w:rPr>
+          <w:sz w:val="24"/>
+          <w:szCs w:val="24"/>
+        </w:rPr>
+        <w:t>Figure 5 shows the add officer form, showing that an officer can be assigned to multiple specific programmes, satisfying requirements B2 and B4, similar concept used within edit officer form.</w:t>
+      </w:r>
+    </w:p>
+    <w:p>
+      <w:pPr>
+        <w:ind w:left="0"/>
+        <w:rPr>
+          <w:sz w:val="24"/>
+          <w:szCs w:val="24"/>
+        </w:rPr>
+      </w:pPr>
+      <w:r>
+        <w:rPr>
+          <w:noProof/>
+          <w14:ligatures w14:val="standardContextual"/>
+        </w:rPr>
+        <w:lastRenderedPageBreak/>
+        <mc:AlternateContent>
+          <mc:Choice Requires="wps">
+            <w:drawing>
+              <wp:anchor distT="0" distB="0" distL="114300" distR="114300" simplePos="0" relativeHeight="251691008" behindDoc="0" locked="0" layoutInCell="1" allowOverlap="1" wp14:anchorId="48A52594" wp14:editId="39112B31">
+                <wp:simplePos x="0" y="0"/>
+                <wp:positionH relativeFrom="column">
+                  <wp:posOffset>693420</wp:posOffset>
+                </wp:positionH>
+                <wp:positionV relativeFrom="paragraph">
+                  <wp:posOffset>4130040</wp:posOffset>
+                </wp:positionV>
+                <wp:extent cx="4335780" cy="285115"/>
+                <wp:effectExtent l="0" t="0" r="0" b="635"/>
+                <wp:wrapNone/>
+                <wp:docPr id="2019231874" name="Text Box 2"/>
+                <wp:cNvGraphicFramePr>
+                  <a:graphicFrameLocks xmlns:a="http://schemas.openxmlformats.org/drawingml/2006/main"/>
+                </wp:cNvGraphicFramePr>
+                <a:graphic xmlns:a="http://schemas.openxmlformats.org/drawingml/2006/main">
+                  <a:graphicData uri="http://schemas.microsoft.com/office/word/2010/wordprocessingShape">
+                    <wps:wsp>
+                      <wps:cNvSpPr txBox="1">
+                        <a:spLocks noChangeArrowheads="1"/>
+                      </wps:cNvSpPr>
+                      <wps:spPr bwMode="auto">
+                        <a:xfrm>
+                          <a:off x="0" y="0"/>
+                          <a:ext cx="4335780" cy="285115"/>
+                        </a:xfrm>
+                        <a:prstGeom prst="rect">
+                          <a:avLst/>
+                        </a:prstGeom>
+                        <a:noFill/>
+                        <a:ln w="9525">
+                          <a:noFill/>
+                          <a:miter lim="800000"/>
+                          <a:headEnd/>
+                          <a:tailEnd/>
+                        </a:ln>
+                      </wps:spPr>
+                      <wps:txbx>
+                        <w:txbxContent>
+                          <w:p>
+                            <w:pPr>
+                              <w:ind w:left="0"/>
+                              <w:rPr>
+                                <w:i/>
+                                <w:iCs/>
+                              </w:rPr>
+                            </w:pPr>
+                            <w:r>
+                              <w:rPr>
+                                <w:b/>
+                                <w:bCs/>
+                              </w:rPr>
+                              <w:t xml:space="preserve">Figure </w:t>
+                            </w:r>
+                            <w:r>
+                              <w:rPr>
+                                <w:b/>
+                                <w:bCs/>
+                              </w:rPr>
+                              <w:t>5</w:t>
+                            </w:r>
+                            <w:r>
+                              <w:rPr>
+                                <w:b/>
+                                <w:bCs/>
+                              </w:rPr>
+                              <w:t xml:space="preserve">. </w:t>
+                            </w:r>
+                            <w:r>
+                              <w:t>Add officer form</w:t>
+                            </w:r>
+                            <w:r>
+                              <w:t xml:space="preserve"> (</w:t>
+                            </w:r>
+                            <w:r>
+                              <w:rPr>
+                                <w:i/>
+                                <w:iCs/>
+                              </w:rPr>
+                              <w:t>“/admin/officer</w:t>
+                            </w:r>
+                            <w:r>
+                              <w:rPr>
+                                <w:i/>
+                                <w:iCs/>
+                              </w:rPr>
+                              <w:t>/add</w:t>
+                            </w:r>
+                            <w:r>
+                              <w:rPr>
+                                <w:i/>
+                                <w:iCs/>
+                              </w:rPr>
+                              <w:t>”)</w:t>
+                            </w:r>
+                          </w:p>
+                        </w:txbxContent>
+                      </wps:txbx>
+                      <wps:bodyPr rot="0" vert="horz" wrap="square" lIns="91440" tIns="45720" rIns="91440" bIns="45720" anchor="t" anchorCtr="0">
+                        <a:spAutoFit/>
+                      </wps:bodyPr>
+                    </wps:wsp>
+                  </a:graphicData>
+                </a:graphic>
+                <wp14:sizeRelH relativeFrom="margin">
+                  <wp14:pctWidth>0</wp14:pctWidth>
+                </wp14:sizeRelH>
+              </wp:anchor>
+            </w:drawing>
+          </mc:Choice>
+          <mc:Fallback>
+            <w:pict>
+              <v:shape w14:anchorId="48A52594" id="Text Box 2" o:spid="_x0000_s1038" type="#_x0000_t202" style="position:absolute;margin-left:54.6pt;margin-top:325.2pt;width:341.4pt;height:22.45pt;z-index:251691008;visibility:visible;mso-wrap-style:square;mso-width-percent:0;mso-wrap-distance-left:9pt;mso-wrap-distance-top:0;mso-wrap-distance-right:9pt;mso-wrap-distance-bottom:0;mso-position-horizontal:absolute;mso-position-horizontal-relative:text;mso-position-vertical:absolute;mso-position-vertical-relative:text;mso-width-percent:0;mso-width-relative:margin;v-text-anchor:top" o:gfxdata="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" filled="f" stroked="f">
+                <v:textbox style="mso-fit-shape-to-text:t">
+                  <w:txbxContent>
+                    <w:p>
+                      <w:pPr>
+                        <w:ind w:left="0"/>
+                        <w:rPr>
+                          <w:i/>
+                          <w:iCs/>
+                        </w:rPr>
+                      </w:pPr>
+                      <w:r>
+                        <w:rPr>
+                          <w:b/>
+                          <w:bCs/>
+                        </w:rPr>
+                        <w:t xml:space="preserve">Figure </w:t>
+                      </w:r>
+                      <w:r>
+                        <w:rPr>
+                          <w:b/>
+                          <w:bCs/>
+                        </w:rPr>
+                        <w:t>5</w:t>
+                      </w:r>
+                      <w:r>
+                        <w:rPr>
+                          <w:b/>
+                          <w:bCs/>
+                        </w:rPr>
+                        <w:t xml:space="preserve">. </w:t>
+                      </w:r>
+                      <w:r>
+                        <w:t>Add officer form</w:t>
+                      </w:r>
+                      <w:r>
+                        <w:t xml:space="preserve"> (</w:t>
+                      </w:r>
+                      <w:r>
+                        <w:rPr>
+                          <w:i/>
+                          <w:iCs/>
+                        </w:rPr>
+                        <w:t>“/admin/officer</w:t>
+                      </w:r>
+                      <w:r>
+                        <w:rPr>
+                          <w:i/>
+                          <w:iCs/>
+                        </w:rPr>
+                        <w:t>/add</w:t>
+                      </w:r>
+                      <w:r>
+                        <w:rPr>
+                          <w:i/>
+                          <w:iCs/>
+                        </w:rPr>
+                        <w:t>”)</w:t>
+                      </w:r>
+                    </w:p>
+                  </w:txbxContent>
+                </v:textbox>
+              </v:shape>
+            </w:pict>
+          </mc:Fallback>
+        </mc:AlternateContent>
+      </w:r>
+      <w:r>
+        <w:rPr>
+          <w:sz w:val="24"/>
+          <w:szCs w:val="24"/>
+        </w:rPr>
+        <w:drawing>
+          <wp:anchor distT="0" distB="0" distL="114300" distR="114300" simplePos="0" relativeHeight="251688960" behindDoc="1" locked="0" layoutInCell="1" allowOverlap="1" wp14:anchorId="0B1460B1" wp14:editId="36EBCA72">
+            <wp:simplePos x="0" y="0"/>
+            <wp:positionH relativeFrom="margin">
+              <wp:posOffset>693420</wp:posOffset>
+            </wp:positionH>
+            <wp:positionV relativeFrom="paragraph">
+              <wp:posOffset>93980</wp:posOffset>
+            </wp:positionV>
+            <wp:extent cx="4335780" cy="4039870"/>
+            <wp:effectExtent l="0" t="0" r="7620" b="0"/>
+            <wp:wrapTopAndBottom/>
+            <wp:docPr id="1154029018" name="Picture 1"/>
+            <wp:cNvGraphicFramePr>
+              <a:graphicFrameLocks xmlns:a="http://schemas.openxmlformats.org/drawingml/2006/main" noChangeAspect="1"/>
+            </wp:cNvGraphicFramePr>
+            <a:graphic xmlns:a="http://schemas.openxmlformats.org/drawingml/2006/main">
+              <a:graphicData uri="http://schemas.openxmlformats.org/drawingml/2006/picture">
+                <pic:pic xmlns:pic="http://schemas.openxmlformats.org/drawingml/2006/picture">
+                  <pic:nvPicPr>
+                    <pic:cNvPr id="1154029018" name=""/>
+                    <pic:cNvPicPr/>
+                  </pic:nvPicPr>
+                  <pic:blipFill>
+                    <a:blip r:embed="rId19">
+                      <a:extLst>
+                        <a:ext uri="{28A0092B-C50C-407E-A947-70E740481C1C}">
+                          <a14:useLocalDpi xmlns:a14="http://schemas.microsoft.com/office/drawing/2010/main" val="0"/>
+                        </a:ext>
+                      </a:extLst>
+                    </a:blip>
+                    <a:stretch>
+                      <a:fillRect/>
+                    </a:stretch>
+                  </pic:blipFill>
+                  <pic:spPr>
+                    <a:xfrm>
+                      <a:off x="0" y="0"/>
+                      <a:ext cx="4335780" cy="4039870"/>
+                    </a:xfrm>
+                    <a:prstGeom prst="rect">
+                      <a:avLst/>
+                    </a:prstGeom>
+                  </pic:spPr>
+                </pic:pic>
+              </a:graphicData>
+            </a:graphic>
+            <wp14:sizeRelH relativeFrom="margin">
+              <wp14:pctWidth>0</wp14:pctWidth>
+            </wp14:sizeRelH>
+            <wp14:sizeRelV relativeFrom="margin">
+              <wp14:pctHeight>0</wp14:pctHeight>
+            </wp14:sizeRelV>
+          </wp:anchor>
+        </w:drawing>
+      </w:r>
+    </w:p>
+    <w:p>
+      <w:pPr>
+        <w:ind w:left="0"/>
+        <w:rPr>
+          <w:i/>
+          <w:iCs/>
+          <w:sz w:val="24"/>
+          <w:szCs w:val="24"/>
+        </w:rPr>
+      </w:pPr>
+    </w:p>
+    <w:p>
+      <w:pPr>
+        <w:ind w:left="0"/>
+        <w:rPr>
+          <w:i/>
+          <w:iCs/>
+          <w:sz w:val="24"/>
+          <w:szCs w:val="24"/>
+        </w:rPr>
+      </w:pPr>
+    </w:p>
+    <w:p>
+      <w:pPr>
+        <w:ind w:left="0"/>
+        <w:rPr>
           <w:i/>
           <w:iCs/>
           <w:sz w:val="24"/>
@@ -1369,27 +2040,17 @@
         <mc:AlternateContent>
           <mc:Choice Requires="wpg">
             <w:drawing>
-              <wp:anchor distT="0" distB="0" distL="114300" distR="114300" simplePos="0" relativeHeight="251669504" behindDoc="1" locked="0" layoutInCell="1" allowOverlap="1" wp14:anchorId="6605C627" wp14:editId="43021D86">
+              <wp:anchor distT="0" distB="0" distL="114300" distR="114300" simplePos="0" relativeHeight="251663360" behindDoc="1" locked="0" layoutInCell="1" allowOverlap="1" wp14:anchorId="6605C627" wp14:editId="0B5DE0E5">
                 <wp:simplePos x="0" y="0"/>
-                <wp:positionH relativeFrom="column">
-                  <wp:posOffset>0</wp:posOffset>
+                <wp:positionH relativeFrom="margin">
+                  <wp:align>left</wp:align>
                 </wp:positionH>
                 <wp:positionV relativeFrom="paragraph">
-                  <wp:posOffset>2127250</wp:posOffset>
+                  <wp:posOffset>290195</wp:posOffset>
                 </wp:positionV>
                 <wp:extent cx="5731510" cy="1870075"/>
                 <wp:effectExtent l="0" t="0" r="2540" b="0"/>
-                <wp:wrapTight wrapText="bothSides">
-                  <wp:wrapPolygon edited="0">
-                    <wp:start x="0" y="0"/>
-                    <wp:lineTo x="0" y="17823"/>
-                    <wp:lineTo x="215" y="21343"/>
-                    <wp:lineTo x="21322" y="21343"/>
-                    <wp:lineTo x="21538" y="17823"/>
-                    <wp:lineTo x="21538" y="0"/>
-                    <wp:lineTo x="0" y="0"/>
-                  </wp:wrapPolygon>
-                </wp:wrapTight>
+                <wp:wrapTopAndBottom/>
                 <wp:docPr id="1858944989" name="Group 4"/>
                 <wp:cNvGraphicFramePr/>
                 <a:graphic xmlns:a="http://schemas.openxmlformats.org/drawingml/2006/main">
@@ -1412,7 +2073,7 @@
                           </pic:cNvPicPr>
                         </pic:nvPicPr>
                         <pic:blipFill>
-                          <a:blip r:embed="rId16" cstate="print">
+                          <a:blip r:embed="rId20" cstate="print">
                             <a:extLst>
                               <a:ext uri="{28A0092B-C50C-407E-A947-70E740481C1C}">
                                 <a14:useLocalDpi xmlns:a14="http://schemas.microsoft.com/office/drawing/2010/main" val="0"/>
@@ -1476,7 +2137,7 @@
                                   <w:b/>
                                   <w:bCs/>
                                 </w:rPr>
-                                <w:t>4</w:t>
+                                <w:t>6</w:t>
                               </w:r>
                               <w:r>
                                 <w:rPr>
@@ -1486,31 +2147,14 @@
                                 <w:t xml:space="preserve">. </w:t>
                               </w:r>
                               <w:r>
-                                <w:t>Programme</w:t>
-                              </w:r>
-                              <w:r>
-                                <w:t xml:space="preserve"> Management page (</w:t>
+                                <w:t>Programme Management page (</w:t>
                               </w:r>
                               <w:r>
                                 <w:rPr>
                                   <w:i/>
                                   <w:iCs/>
                                 </w:rPr>
-                                <w:t>“/admin/</w:t>
-                              </w:r>
-                              <w:r>
-                                <w:rPr>
-                                  <w:i/>
-                                  <w:iCs/>
-                                </w:rPr>
-                                <w:t>programmes</w:t>
-                              </w:r>
-                              <w:r>
-                                <w:rPr>
-                                  <w:i/>
-                                  <w:iCs/>
-                                </w:rPr>
-                                <w:t>”)</w:t>
+                                <w:t>“/admin/programmes”)</w:t>
                               </w:r>
                             </w:p>
                           </w:txbxContent>
@@ -1527,11 +2171,11 @@
           </mc:Choice>
           <mc:Fallback>
             <w:pict>
-              <v:group w14:anchorId="6605C627" id="Group 4" o:spid="_x0000_s1035" style="position:absolute;margin-left:0;margin-top:167.5pt;width:451.3pt;height:147.25pt;z-index:-251646976" coordsize="57315,18700" o:gfxdata="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">
-                <v:shape id="Picture 1" o:spid="_x0000_s1036" type="#_x0000_t75" style="position:absolute;width:57315;height:15373;visibility:visible;mso-wrap-style:square" o:gfxdata="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">
-                  <v:imagedata r:id="rId17" o:title=""/>
+              <v:group w14:anchorId="6605C627" id="Group 4" o:spid="_x0000_s1039" style="position:absolute;margin-left:0;margin-top:22.85pt;width:451.3pt;height:147.25pt;z-index:-251653120;mso-position-horizontal:left;mso-position-horizontal-relative:margin" coordsize="57315,18700" o:gfxdata="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">
+                <v:shape id="Picture 1" o:spid="_x0000_s1040" type="#_x0000_t75" style="position:absolute;width:57315;height:15373;visibility:visible;mso-wrap-style:square" o:gfxdata="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">
+                  <v:imagedata r:id="rId21" o:title=""/>
                 </v:shape>
-                <v:shape id="_x0000_s1037" type="#_x0000_t202" style="position:absolute;top:15849;width:57226;height:2851;visibility:visible;mso-wrap-style:square;v-text-anchor:top" o:gfxdata="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" filled="f" stroked="f">
+                <v:shape id="_x0000_s1041" type="#_x0000_t202" style="position:absolute;top:15849;width:57226;height:2851;visibility:visible;mso-wrap-style:square;v-text-anchor:top" o:gfxdata="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" filled="f" stroked="f">
                   <v:textbox style="mso-fit-shape-to-text:t">
                     <w:txbxContent>
                       <w:p>
@@ -1554,7 +2198,7 @@
                             <w:b/>
                             <w:bCs/>
                           </w:rPr>
-                          <w:t>4</w:t>
+                          <w:t>6</w:t>
                         </w:r>
                         <w:r>
                           <w:rPr>
@@ -1564,37 +2208,20 @@
                           <w:t xml:space="preserve">. </w:t>
                         </w:r>
                         <w:r>
-                          <w:t>Programme</w:t>
-                        </w:r>
-                        <w:r>
-                          <w:t xml:space="preserve"> Management page (</w:t>
+                          <w:t>Programme Management page (</w:t>
                         </w:r>
                         <w:r>
                           <w:rPr>
                             <w:i/>
                             <w:iCs/>
                           </w:rPr>
-                          <w:t>“/admin/</w:t>
-                        </w:r>
-                        <w:r>
-                          <w:rPr>
-                            <w:i/>
-                            <w:iCs/>
-                          </w:rPr>
-                          <w:t>programmes</w:t>
-                        </w:r>
-                        <w:r>
-                          <w:rPr>
-                            <w:i/>
-                            <w:iCs/>
-                          </w:rPr>
-                          <w:t>”)</w:t>
+                          <w:t>“/admin/programmes”)</w:t>
                         </w:r>
                       </w:p>
                     </w:txbxContent>
                   </v:textbox>
                 </v:shape>
-                <w10:wrap type="tight"/>
+                <w10:wrap type="topAndBottom" anchorx="margin"/>
               </v:group>
             </w:pict>
           </mc:Fallback>
@@ -1614,209 +2241,174 @@
       <w:pPr>
         <w:ind w:left="0"/>
         <w:rPr>
+          <w:sz w:val="24"/>
+          <w:szCs w:val="24"/>
+        </w:rPr>
+      </w:pPr>
+      <w:r>
+        <w:rPr>
+          <w:sz w:val="24"/>
+          <w:szCs w:val="24"/>
+        </w:rPr>
+        <w:t>Figure 6 shows programme management page, which allows admin to create programme with base classification rules, satisfying requirement B3.</w:t>
+      </w:r>
+    </w:p>
+    <w:p>
+      <w:pPr>
+        <w:ind w:left="0"/>
+        <w:rPr>
+          <w:sz w:val="24"/>
+          <w:szCs w:val="24"/>
+        </w:rPr>
+      </w:pPr>
+    </w:p>
+    <w:p>
+      <w:pPr>
+        <w:ind w:left="0"/>
+        <w:rPr>
           <w:i/>
           <w:iCs/>
           <w:sz w:val="24"/>
           <w:szCs w:val="24"/>
         </w:rPr>
       </w:pPr>
-    </w:p>
-    <w:p>
-      <w:pPr>
-        <w:ind w:left="0"/>
+      <w:r>
         <w:rPr>
           <w:i/>
           <w:iCs/>
-          <w:sz w:val="24"/>
-          <w:szCs w:val="24"/>
-        </w:rPr>
-      </w:pPr>
-    </w:p>
-    <w:p>
-      <w:pPr>
-        <w:ind w:left="0"/>
-        <w:rPr>
-          <w:i/>
-          <w:iCs/>
-          <w:sz w:val="24"/>
-          <w:szCs w:val="24"/>
-        </w:rPr>
-      </w:pPr>
-    </w:p>
-    <w:p>
-      <w:pPr>
-        <w:ind w:left="0"/>
-        <w:rPr>
-          <w:i/>
-          <w:iCs/>
-          <w:sz w:val="24"/>
-          <w:szCs w:val="24"/>
-        </w:rPr>
-      </w:pPr>
-    </w:p>
-    <w:p>
-      <w:pPr>
-        <w:ind w:left="0"/>
-        <w:rPr>
-          <w:i/>
-          <w:iCs/>
-          <w:sz w:val="24"/>
-          <w:szCs w:val="24"/>
-        </w:rPr>
-      </w:pPr>
-    </w:p>
-    <w:p>
-      <w:pPr>
-        <w:ind w:left="0"/>
-        <w:rPr>
-          <w:i/>
-          <w:iCs/>
-          <w:sz w:val="24"/>
-          <w:szCs w:val="24"/>
-        </w:rPr>
-      </w:pPr>
-    </w:p>
-    <w:p>
-      <w:pPr>
-        <w:ind w:left="0"/>
-        <w:rPr>
-          <w:i/>
-          <w:iCs/>
-          <w:sz w:val="24"/>
-          <w:szCs w:val="24"/>
-        </w:rPr>
-      </w:pPr>
-      <w:r>
-        <w:rPr>
-          <w:i/>
-          <w:iCs/>
-          <w:sz w:val="24"/>
-          <w:szCs w:val="24"/>
+          <w:noProof/>
+          <w:sz w:val="24"/>
+          <w:szCs w:val="24"/>
+          <w14:ligatures w14:val="standardContextual"/>
         </w:rPr>
         <w:lastRenderedPageBreak/>
-        <w:t>Officer Dashboard</w:t>
-      </w:r>
-    </w:p>
-    <w:p>
-      <w:pPr>
-        <w:ind w:left="0"/>
-        <w:rPr>
-          <w:i/>
-          <w:iCs/>
-          <w:sz w:val="24"/>
-          <w:szCs w:val="24"/>
-        </w:rPr>
-      </w:pPr>
-      <w:r>
-        <w:rPr>
-          <w:noProof/>
-          <w14:ligatures w14:val="standardContextual"/>
-        </w:rPr>
         <mc:AlternateContent>
-          <mc:Choice Requires="wps">
+          <mc:Choice Requires="wpg">
             <w:drawing>
-              <wp:anchor distT="0" distB="0" distL="114300" distR="114300" simplePos="0" relativeHeight="251671552" behindDoc="0" locked="0" layoutInCell="1" allowOverlap="1" wp14:anchorId="08B035C0" wp14:editId="4AC14BF0">
+              <wp:anchor distT="0" distB="0" distL="114300" distR="114300" simplePos="0" relativeHeight="251667456" behindDoc="1" locked="0" layoutInCell="1" allowOverlap="1" wp14:anchorId="06DD2E53" wp14:editId="5AE40D40">
                 <wp:simplePos x="0" y="0"/>
                 <wp:positionH relativeFrom="margin">
-                  <wp:posOffset>-6350</wp:posOffset>
+                  <wp:align>left</wp:align>
                 </wp:positionH>
                 <wp:positionV relativeFrom="paragraph">
-                  <wp:posOffset>1157605</wp:posOffset>
+                  <wp:posOffset>322252</wp:posOffset>
                 </wp:positionV>
-                <wp:extent cx="5722620" cy="285115"/>
-                <wp:effectExtent l="0" t="0" r="0" b="635"/>
-                <wp:wrapNone/>
-                <wp:docPr id="138785914" name="Text Box 2"/>
-                <wp:cNvGraphicFramePr>
-                  <a:graphicFrameLocks xmlns:a="http://schemas.openxmlformats.org/drawingml/2006/main"/>
-                </wp:cNvGraphicFramePr>
+                <wp:extent cx="5731510" cy="1473835"/>
+                <wp:effectExtent l="0" t="0" r="2540" b="0"/>
+                <wp:wrapTopAndBottom/>
+                <wp:docPr id="2129090148" name="Group 6"/>
+                <wp:cNvGraphicFramePr/>
                 <a:graphic xmlns:a="http://schemas.openxmlformats.org/drawingml/2006/main">
-                  <a:graphicData uri="http://schemas.microsoft.com/office/word/2010/wordprocessingShape">
-                    <wps:wsp>
-                      <wps:cNvSpPr txBox="1">
-                        <a:spLocks noChangeArrowheads="1"/>
-                      </wps:cNvSpPr>
-                      <wps:spPr bwMode="auto">
+                  <a:graphicData uri="http://schemas.microsoft.com/office/word/2010/wordprocessingGroup">
+                    <wpg:wgp>
+                      <wpg:cNvGrpSpPr/>
+                      <wpg:grpSpPr>
                         <a:xfrm>
                           <a:off x="0" y="0"/>
-                          <a:ext cx="5722620" cy="285115"/>
+                          <a:ext cx="5731510" cy="1473835"/>
+                          <a:chOff x="0" y="0"/>
+                          <a:chExt cx="5731510" cy="1473835"/>
                         </a:xfrm>
-                        <a:prstGeom prst="rect">
-                          <a:avLst/>
-                        </a:prstGeom>
-                        <a:noFill/>
-                        <a:ln w="9525">
+                      </wpg:grpSpPr>
+                      <pic:pic xmlns:pic="http://schemas.openxmlformats.org/drawingml/2006/picture">
+                        <pic:nvPicPr>
+                          <pic:cNvPr id="667440203" name="Picture 1"/>
+                          <pic:cNvPicPr>
+                            <a:picLocks noChangeAspect="1"/>
+                          </pic:cNvPicPr>
+                        </pic:nvPicPr>
+                        <pic:blipFill>
+                          <a:blip r:embed="rId22" cstate="print">
+                            <a:extLst>
+                              <a:ext uri="{28A0092B-C50C-407E-A947-70E740481C1C}">
+                                <a14:useLocalDpi xmlns:a14="http://schemas.microsoft.com/office/drawing/2010/main" val="0"/>
+                              </a:ext>
+                            </a:extLst>
+                          </a:blip>
+                          <a:stretch>
+                            <a:fillRect/>
+                          </a:stretch>
+                        </pic:blipFill>
+                        <pic:spPr>
+                          <a:xfrm>
+                            <a:off x="0" y="0"/>
+                            <a:ext cx="5731510" cy="1157605"/>
+                          </a:xfrm>
+                          <a:prstGeom prst="rect">
+                            <a:avLst/>
+                          </a:prstGeom>
+                        </pic:spPr>
+                      </pic:pic>
+                      <wps:wsp>
+                        <wps:cNvPr id="1463781273" name="Text Box 2"/>
+                        <wps:cNvSpPr txBox="1">
+                          <a:spLocks noChangeArrowheads="1"/>
+                        </wps:cNvSpPr>
+                        <wps:spPr bwMode="auto">
+                          <a:xfrm>
+                            <a:off x="0" y="1188720"/>
+                            <a:ext cx="5722620" cy="285115"/>
+                          </a:xfrm>
+                          <a:prstGeom prst="rect">
+                            <a:avLst/>
+                          </a:prstGeom>
                           <a:noFill/>
-                          <a:miter lim="800000"/>
-                          <a:headEnd/>
-                          <a:tailEnd/>
-                        </a:ln>
-                      </wps:spPr>
-                      <wps:txbx>
-                        <w:txbxContent>
-                          <w:p>
-                            <w:pPr>
-                              <w:ind w:left="0"/>
-                              <w:rPr>
-                                <w:i/>
-                                <w:iCs/>
-                              </w:rPr>
-                            </w:pPr>
-                            <w:r>
-                              <w:rPr>
-                                <w:b/>
-                                <w:bCs/>
-                              </w:rPr>
-                              <w:t xml:space="preserve">Figure </w:t>
-                            </w:r>
-                            <w:r>
-                              <w:rPr>
-                                <w:b/>
-                                <w:bCs/>
-                              </w:rPr>
-                              <w:t>5</w:t>
-                            </w:r>
-                            <w:r>
-                              <w:rPr>
-                                <w:b/>
-                                <w:bCs/>
-                              </w:rPr>
-                              <w:t xml:space="preserve">. </w:t>
-                            </w:r>
-                            <w:r>
-                              <w:t>Officer Dashboard</w:t>
-                            </w:r>
-                            <w:r>
-                              <w:t xml:space="preserve"> (</w:t>
-                            </w:r>
-                            <w:r>
-                              <w:rPr>
-                                <w:i/>
-                                <w:iCs/>
-                              </w:rPr>
-                              <w:t>“/</w:t>
-                            </w:r>
-                            <w:r>
-                              <w:rPr>
-                                <w:i/>
-                                <w:iCs/>
-                              </w:rPr>
-                              <w:t>officer</w:t>
-                            </w:r>
-                            <w:r>
-                              <w:rPr>
-                                <w:i/>
-                                <w:iCs/>
-                              </w:rPr>
-                              <w:t>”)</w:t>
-                            </w:r>
-                          </w:p>
-                        </w:txbxContent>
-                      </wps:txbx>
-                      <wps:bodyPr rot="0" vert="horz" wrap="square" lIns="91440" tIns="45720" rIns="91440" bIns="45720" anchor="t" anchorCtr="0">
-                        <a:spAutoFit/>
-                      </wps:bodyPr>
-                    </wps:wsp>
+                          <a:ln w="9525">
+                            <a:noFill/>
+                            <a:miter lim="800000"/>
+                            <a:headEnd/>
+                            <a:tailEnd/>
+                          </a:ln>
+                        </wps:spPr>
+                        <wps:txbx>
+                          <w:txbxContent>
+                            <w:p>
+                              <w:pPr>
+                                <w:ind w:left="0"/>
+                                <w:rPr>
+                                  <w:i/>
+                                  <w:iCs/>
+                                </w:rPr>
+                              </w:pPr>
+                              <w:r>
+                                <w:rPr>
+                                  <w:b/>
+                                  <w:bCs/>
+                                </w:rPr>
+                                <w:t xml:space="preserve">Figure </w:t>
+                              </w:r>
+                              <w:r>
+                                <w:rPr>
+                                  <w:b/>
+                                  <w:bCs/>
+                                </w:rPr>
+                                <w:t>7</w:t>
+                              </w:r>
+                              <w:r>
+                                <w:rPr>
+                                  <w:b/>
+                                  <w:bCs/>
+                                </w:rPr>
+                                <w:t xml:space="preserve">. </w:t>
+                              </w:r>
+                              <w:r>
+                                <w:t>Officer Dashboard (</w:t>
+                              </w:r>
+                              <w:r>
+                                <w:rPr>
+                                  <w:i/>
+                                  <w:iCs/>
+                                </w:rPr>
+                                <w:t>“/officer”)</w:t>
+                              </w:r>
+                            </w:p>
+                          </w:txbxContent>
+                        </wps:txbx>
+                        <wps:bodyPr rot="0" vert="horz" wrap="square" lIns="91440" tIns="45720" rIns="91440" bIns="45720" anchor="t" anchorCtr="0">
+                          <a:spAutoFit/>
+                        </wps:bodyPr>
+                      </wps:wsp>
+                    </wpg:wgp>
                   </a:graphicData>
                 </a:graphic>
               </wp:anchor>
@@ -1824,70 +2416,58 @@
           </mc:Choice>
           <mc:Fallback>
             <w:pict>
-              <v:shape w14:anchorId="08B035C0" id="Text Box 2" o:spid="_x0000_s1038" type="#_x0000_t202" style="position:absolute;margin-left:-.5pt;margin-top:91.15pt;width:450.6pt;height:22.45pt;z-index:251671552;visibility:visible;mso-wrap-style:square;mso-wrap-distance-left:9pt;mso-wrap-distance-top:0;mso-wrap-distance-right:9pt;mso-wrap-distance-bottom:0;mso-position-horizontal:absolute;mso-position-horizontal-relative:margin;mso-position-vertical:absolute;mso-position-vertical-relative:text;v-text-anchor:top" o:gfxdata="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" filled="f" stroked="f">
-                <v:textbox style="mso-fit-shape-to-text:t">
-                  <w:txbxContent>
-                    <w:p>
-                      <w:pPr>
-                        <w:ind w:left="0"/>
-                        <w:rPr>
-                          <w:i/>
-                          <w:iCs/>
-                        </w:rPr>
-                      </w:pPr>
-                      <w:r>
-                        <w:rPr>
-                          <w:b/>
-                          <w:bCs/>
-                        </w:rPr>
-                        <w:t xml:space="preserve">Figure </w:t>
-                      </w:r>
-                      <w:r>
-                        <w:rPr>
-                          <w:b/>
-                          <w:bCs/>
-                        </w:rPr>
-                        <w:t>5</w:t>
-                      </w:r>
-                      <w:r>
-                        <w:rPr>
-                          <w:b/>
-                          <w:bCs/>
-                        </w:rPr>
-                        <w:t xml:space="preserve">. </w:t>
-                      </w:r>
-                      <w:r>
-                        <w:t>Officer Dashboard</w:t>
-                      </w:r>
-                      <w:r>
-                        <w:t xml:space="preserve"> (</w:t>
-                      </w:r>
-                      <w:r>
-                        <w:rPr>
-                          <w:i/>
-                          <w:iCs/>
-                        </w:rPr>
-                        <w:t>“/</w:t>
-                      </w:r>
-                      <w:r>
-                        <w:rPr>
-                          <w:i/>
-                          <w:iCs/>
-                        </w:rPr>
-                        <w:t>officer</w:t>
-                      </w:r>
-                      <w:r>
-                        <w:rPr>
-                          <w:i/>
-                          <w:iCs/>
-                        </w:rPr>
-                        <w:t>”)</w:t>
-                      </w:r>
-                    </w:p>
-                  </w:txbxContent>
-                </v:textbox>
-                <w10:wrap anchorx="margin"/>
-              </v:shape>
+              <v:group w14:anchorId="06DD2E53" id="Group 6" o:spid="_x0000_s1042" style="position:absolute;margin-left:0;margin-top:25.35pt;width:451.3pt;height:116.05pt;z-index:-251649024;mso-position-horizontal:left;mso-position-horizontal-relative:margin" coordsize="57315,14738" o:gfxdata="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">
+                <v:shape id="Picture 1" o:spid="_x0000_s1043" type="#_x0000_t75" style="position:absolute;width:57315;height:11576;visibility:visible;mso-wrap-style:square" o:gfxdata="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">
+                  <v:imagedata r:id="rId23" o:title=""/>
+                </v:shape>
+                <v:shape id="_x0000_s1044" type="#_x0000_t202" style="position:absolute;top:11887;width:57226;height:2851;visibility:visible;mso-wrap-style:square;v-text-anchor:top" o:gfxdata="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" filled="f" stroked="f">
+                  <v:textbox style="mso-fit-shape-to-text:t">
+                    <w:txbxContent>
+                      <w:p>
+                        <w:pPr>
+                          <w:ind w:left="0"/>
+                          <w:rPr>
+                            <w:i/>
+                            <w:iCs/>
+                          </w:rPr>
+                        </w:pPr>
+                        <w:r>
+                          <w:rPr>
+                            <w:b/>
+                            <w:bCs/>
+                          </w:rPr>
+                          <w:t xml:space="preserve">Figure </w:t>
+                        </w:r>
+                        <w:r>
+                          <w:rPr>
+                            <w:b/>
+                            <w:bCs/>
+                          </w:rPr>
+                          <w:t>7</w:t>
+                        </w:r>
+                        <w:r>
+                          <w:rPr>
+                            <w:b/>
+                            <w:bCs/>
+                          </w:rPr>
+                          <w:t xml:space="preserve">. </w:t>
+                        </w:r>
+                        <w:r>
+                          <w:t>Officer Dashboard (</w:t>
+                        </w:r>
+                        <w:r>
+                          <w:rPr>
+                            <w:i/>
+                            <w:iCs/>
+                          </w:rPr>
+                          <w:t>“/officer”)</w:t>
+                        </w:r>
+                      </w:p>
+                    </w:txbxContent>
+                  </v:textbox>
+                </v:shape>
+                <w10:wrap type="topAndBottom" anchorx="margin"/>
+              </v:group>
             </w:pict>
           </mc:Fallback>
         </mc:AlternateContent>
@@ -1899,41 +2479,23 @@
           <w:sz w:val="24"/>
           <w:szCs w:val="24"/>
         </w:rPr>
-        <w:drawing>
-          <wp:inline distT="0" distB="0" distL="0" distR="0" wp14:anchorId="17F28002" wp14:editId="4CD71B2C">
-            <wp:extent cx="5731510" cy="1157605"/>
-            <wp:effectExtent l="0" t="0" r="2540" b="4445"/>
-            <wp:docPr id="607479588" name="Picture 1"/>
-            <wp:cNvGraphicFramePr>
-              <a:graphicFrameLocks xmlns:a="http://schemas.openxmlformats.org/drawingml/2006/main" noChangeAspect="1"/>
-            </wp:cNvGraphicFramePr>
-            <a:graphic xmlns:a="http://schemas.openxmlformats.org/drawingml/2006/main">
-              <a:graphicData uri="http://schemas.openxmlformats.org/drawingml/2006/picture">
-                <pic:pic xmlns:pic="http://schemas.openxmlformats.org/drawingml/2006/picture">
-                  <pic:nvPicPr>
-                    <pic:cNvPr id="607479588" name=""/>
-                    <pic:cNvPicPr/>
-                  </pic:nvPicPr>
-                  <pic:blipFill>
-                    <a:blip r:embed="rId18"/>
-                    <a:stretch>
-                      <a:fillRect/>
-                    </a:stretch>
-                  </pic:blipFill>
-                  <pic:spPr>
-                    <a:xfrm>
-                      <a:off x="0" y="0"/>
-                      <a:ext cx="5731510" cy="1157605"/>
-                    </a:xfrm>
-                    <a:prstGeom prst="rect">
-                      <a:avLst/>
-                    </a:prstGeom>
-                  </pic:spPr>
-                </pic:pic>
-              </a:graphicData>
-            </a:graphic>
-          </wp:inline>
-        </w:drawing>
+        <w:t>Officer Dashboard</w:t>
+      </w:r>
+    </w:p>
+    <w:p>
+      <w:pPr>
+        <w:ind w:left="0"/>
+        <w:rPr>
+          <w:sz w:val="24"/>
+          <w:szCs w:val="24"/>
+        </w:rPr>
+      </w:pPr>
+      <w:r>
+        <w:rPr>
+          <w:sz w:val="24"/>
+          <w:szCs w:val="24"/>
+        </w:rPr>
+        <w:t>Figure 7 shows officer dashboard, which shows details of each programme assigned to specific officer. Selecting manage cohort will display Figure 8 page, and selecting view statistics will display Figure 10 page. This page satisfies requirement C1.</w:t>
       </w:r>
     </w:p>
     <w:p>
@@ -1957,17 +2519,303 @@
           <w:szCs w:val="24"/>
         </w:rPr>
       </w:pPr>
-    </w:p>
-    <w:p>
-      <w:pPr>
-        <w:ind w:left="0"/>
+      <w:r>
         <w:rPr>
           <w:i/>
           <w:iCs/>
-          <w:sz w:val="24"/>
-          <w:szCs w:val="24"/>
-        </w:rPr>
-      </w:pPr>
+          <w:noProof/>
+          <w:sz w:val="24"/>
+          <w:szCs w:val="24"/>
+          <w14:ligatures w14:val="standardContextual"/>
+        </w:rPr>
+        <mc:AlternateContent>
+          <mc:Choice Requires="wpg">
+            <w:drawing>
+              <wp:anchor distT="0" distB="0" distL="114300" distR="114300" simplePos="0" relativeHeight="251671552" behindDoc="1" locked="0" layoutInCell="1" allowOverlap="1" wp14:anchorId="0EFFF049" wp14:editId="54C233B1">
+                <wp:simplePos x="0" y="0"/>
+                <wp:positionH relativeFrom="margin">
+                  <wp:align>center</wp:align>
+                </wp:positionH>
+                <wp:positionV relativeFrom="paragraph">
+                  <wp:posOffset>327222</wp:posOffset>
+                </wp:positionV>
+                <wp:extent cx="6294120" cy="3020695"/>
+                <wp:effectExtent l="0" t="0" r="0" b="0"/>
+                <wp:wrapTopAndBottom/>
+                <wp:docPr id="877909994" name="Group 7"/>
+                <wp:cNvGraphicFramePr/>
+                <a:graphic xmlns:a="http://schemas.openxmlformats.org/drawingml/2006/main">
+                  <a:graphicData uri="http://schemas.microsoft.com/office/word/2010/wordprocessingGroup">
+                    <wpg:wgp>
+                      <wpg:cNvGrpSpPr/>
+                      <wpg:grpSpPr>
+                        <a:xfrm>
+                          <a:off x="0" y="0"/>
+                          <a:ext cx="6294120" cy="3020695"/>
+                          <a:chOff x="0" y="0"/>
+                          <a:chExt cx="6294120" cy="3020695"/>
+                        </a:xfrm>
+                      </wpg:grpSpPr>
+                      <pic:pic xmlns:pic="http://schemas.openxmlformats.org/drawingml/2006/picture">
+                        <pic:nvPicPr>
+                          <pic:cNvPr id="2136305016" name="Picture 1"/>
+                          <pic:cNvPicPr>
+                            <a:picLocks noChangeAspect="1"/>
+                          </pic:cNvPicPr>
+                        </pic:nvPicPr>
+                        <pic:blipFill>
+                          <a:blip r:embed="rId24" cstate="print">
+                            <a:extLst>
+                              <a:ext uri="{28A0092B-C50C-407E-A947-70E740481C1C}">
+                                <a14:useLocalDpi xmlns:a14="http://schemas.microsoft.com/office/drawing/2010/main" val="0"/>
+                              </a:ext>
+                            </a:extLst>
+                          </a:blip>
+                          <a:stretch>
+                            <a:fillRect/>
+                          </a:stretch>
+                        </pic:blipFill>
+                        <pic:spPr>
+                          <a:xfrm>
+                            <a:off x="30480" y="0"/>
+                            <a:ext cx="6263640" cy="2743200"/>
+                          </a:xfrm>
+                          <a:prstGeom prst="rect">
+                            <a:avLst/>
+                          </a:prstGeom>
+                        </pic:spPr>
+                      </pic:pic>
+                      <wps:wsp>
+                        <wps:cNvPr id="433374782" name="Text Box 2"/>
+                        <wps:cNvSpPr txBox="1">
+                          <a:spLocks noChangeArrowheads="1"/>
+                        </wps:cNvSpPr>
+                        <wps:spPr bwMode="auto">
+                          <a:xfrm>
+                            <a:off x="0" y="2735580"/>
+                            <a:ext cx="6278880" cy="285115"/>
+                          </a:xfrm>
+                          <a:prstGeom prst="rect">
+                            <a:avLst/>
+                          </a:prstGeom>
+                          <a:noFill/>
+                          <a:ln w="9525">
+                            <a:noFill/>
+                            <a:miter lim="800000"/>
+                            <a:headEnd/>
+                            <a:tailEnd/>
+                          </a:ln>
+                        </wps:spPr>
+                        <wps:txbx>
+                          <w:txbxContent>
+                            <w:p>
+                              <w:pPr>
+                                <w:ind w:left="0"/>
+                                <w:rPr>
+                                  <w:i/>
+                                  <w:iCs/>
+                                </w:rPr>
+                              </w:pPr>
+                              <w:r>
+                                <w:rPr>
+                                  <w:b/>
+                                  <w:bCs/>
+                                </w:rPr>
+                                <w:t xml:space="preserve">Figure </w:t>
+                              </w:r>
+                              <w:r>
+                                <w:rPr>
+                                  <w:b/>
+                                  <w:bCs/>
+                                </w:rPr>
+                                <w:t>8</w:t>
+                              </w:r>
+                              <w:r>
+                                <w:rPr>
+                                  <w:b/>
+                                  <w:bCs/>
+                                </w:rPr>
+                                <w:t>.</w:t>
+                              </w:r>
+                              <w:r>
+                                <w:rPr>
+                                  <w:b/>
+                                  <w:bCs/>
+                                </w:rPr>
+                                <w:t xml:space="preserve"> </w:t>
+                              </w:r>
+                              <w:r>
+                                <w:t>Student Management</w:t>
+                              </w:r>
+                              <w:r>
+                                <w:t xml:space="preserve"> (</w:t>
+                              </w:r>
+                              <w:r>
+                                <w:rPr>
+                                  <w:i/>
+                                  <w:iCs/>
+                                </w:rPr>
+                                <w:t>“/officer</w:t>
+                              </w:r>
+                              <w:r>
+                                <w:rPr>
+                                  <w:i/>
+                                  <w:iCs/>
+                                </w:rPr>
+                                <w:t>/programme</w:t>
+                              </w:r>
+                              <w:proofErr w:type="gramStart"/>
+                              <w:r>
+                                <w:rPr>
+                                  <w:i/>
+                                  <w:iCs/>
+                                </w:rPr>
+                                <w:t>/:</w:t>
+                              </w:r>
+                              <w:proofErr w:type="spellStart"/>
+                              <w:r>
+                                <w:rPr>
+                                  <w:i/>
+                                  <w:iCs/>
+                                </w:rPr>
+                                <w:t>programmeId</w:t>
+                              </w:r>
+                              <w:proofErr w:type="spellEnd"/>
+                              <w:proofErr w:type="gramEnd"/>
+                              <w:r>
+                                <w:rPr>
+                                  <w:i/>
+                                  <w:iCs/>
+                                </w:rPr>
+                                <w:t>/students</w:t>
+                              </w:r>
+                              <w:r>
+                                <w:rPr>
+                                  <w:i/>
+                                  <w:iCs/>
+                                </w:rPr>
+                                <w:t>”)</w:t>
+                              </w:r>
+                            </w:p>
+                          </w:txbxContent>
+                        </wps:txbx>
+                        <wps:bodyPr rot="0" vert="horz" wrap="square" lIns="91440" tIns="45720" rIns="91440" bIns="45720" anchor="t" anchorCtr="0">
+                          <a:spAutoFit/>
+                        </wps:bodyPr>
+                      </wps:wsp>
+                    </wpg:wgp>
+                  </a:graphicData>
+                </a:graphic>
+              </wp:anchor>
+            </w:drawing>
+          </mc:Choice>
+          <mc:Fallback>
+            <w:pict>
+              <v:group w14:anchorId="0EFFF049" id="Group 7" o:spid="_x0000_s1045" style="position:absolute;margin-left:0;margin-top:25.75pt;width:495.6pt;height:237.85pt;z-index:-251644928;mso-position-horizontal:center;mso-position-horizontal-relative:margin" coordsize="62941,30206" o:gfxdata="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">
+                <v:shape id="Picture 1" o:spid="_x0000_s1046" type="#_x0000_t75" style="position:absolute;left:304;width:62637;height:27432;visibility:visible;mso-wrap-style:square" o:gfxdata="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">
+                  <v:imagedata r:id="rId25" o:title=""/>
+                </v:shape>
+                <v:shape id="_x0000_s1047" type="#_x0000_t202" style="position:absolute;top:27355;width:62788;height:2851;visibility:visible;mso-wrap-style:square;v-text-anchor:top" o:gfxdata="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" filled="f" stroked="f">
+                  <v:textbox style="mso-fit-shape-to-text:t">
+                    <w:txbxContent>
+                      <w:p>
+                        <w:pPr>
+                          <w:ind w:left="0"/>
+                          <w:rPr>
+                            <w:i/>
+                            <w:iCs/>
+                          </w:rPr>
+                        </w:pPr>
+                        <w:r>
+                          <w:rPr>
+                            <w:b/>
+                            <w:bCs/>
+                          </w:rPr>
+                          <w:t xml:space="preserve">Figure </w:t>
+                        </w:r>
+                        <w:r>
+                          <w:rPr>
+                            <w:b/>
+                            <w:bCs/>
+                          </w:rPr>
+                          <w:t>8</w:t>
+                        </w:r>
+                        <w:r>
+                          <w:rPr>
+                            <w:b/>
+                            <w:bCs/>
+                          </w:rPr>
+                          <w:t>.</w:t>
+                        </w:r>
+                        <w:r>
+                          <w:rPr>
+                            <w:b/>
+                            <w:bCs/>
+                          </w:rPr>
+                          <w:t xml:space="preserve"> </w:t>
+                        </w:r>
+                        <w:r>
+                          <w:t>Student Management</w:t>
+                        </w:r>
+                        <w:r>
+                          <w:t xml:space="preserve"> (</w:t>
+                        </w:r>
+                        <w:r>
+                          <w:rPr>
+                            <w:i/>
+                            <w:iCs/>
+                          </w:rPr>
+                          <w:t>“/officer</w:t>
+                        </w:r>
+                        <w:r>
+                          <w:rPr>
+                            <w:i/>
+                            <w:iCs/>
+                          </w:rPr>
+                          <w:t>/programme</w:t>
+                        </w:r>
+                        <w:proofErr w:type="gramStart"/>
+                        <w:r>
+                          <w:rPr>
+                            <w:i/>
+                            <w:iCs/>
+                          </w:rPr>
+                          <w:t>/:</w:t>
+                        </w:r>
+                        <w:proofErr w:type="spellStart"/>
+                        <w:r>
+                          <w:rPr>
+                            <w:i/>
+                            <w:iCs/>
+                          </w:rPr>
+                          <w:t>programmeId</w:t>
+                        </w:r>
+                        <w:proofErr w:type="spellEnd"/>
+                        <w:proofErr w:type="gramEnd"/>
+                        <w:r>
+                          <w:rPr>
+                            <w:i/>
+                            <w:iCs/>
+                          </w:rPr>
+                          <w:t>/students</w:t>
+                        </w:r>
+                        <w:r>
+                          <w:rPr>
+                            <w:i/>
+                            <w:iCs/>
+                          </w:rPr>
+                          <w:t>”)</w:t>
+                        </w:r>
+                      </w:p>
+                    </w:txbxContent>
+                  </v:textbox>
+                </v:shape>
+                <w10:wrap type="topAndBottom" anchorx="margin"/>
+              </v:group>
+            </w:pict>
+          </mc:Fallback>
+        </mc:AlternateContent>
+      </w:r>
       <w:r>
         <w:rPr>
           <w:i/>
@@ -1982,32 +2830,457 @@
       <w:pPr>
         <w:ind w:left="0"/>
         <w:rPr>
+          <w:sz w:val="24"/>
+          <w:szCs w:val="24"/>
+        </w:rPr>
+      </w:pPr>
+      <w:r>
+        <w:rPr>
+          <w:sz w:val="24"/>
+          <w:szCs w:val="24"/>
+        </w:rPr>
+        <w:t>Figure 8 shows cohort summary/student management page for specific programme. Here, officer can view the student’s results (shown in Figure 9.1), edit their details, delete their record, and add a new student, satisfying requirement C2.</w:t>
+      </w:r>
+    </w:p>
+    <w:p>
+      <w:pPr>
+        <w:ind w:left="0"/>
+        <w:rPr>
+          <w:sz w:val="24"/>
+          <w:szCs w:val="24"/>
+        </w:rPr>
+      </w:pPr>
+    </w:p>
+    <w:p>
+      <w:pPr>
+        <w:ind w:left="0"/>
+        <w:rPr>
+          <w:sz w:val="24"/>
+          <w:szCs w:val="24"/>
+        </w:rPr>
+      </w:pPr>
+      <w:r>
+        <w:rPr>
+          <w:sz w:val="24"/>
+          <w:szCs w:val="24"/>
+        </w:rPr>
+        <w:t>The system will generate proposed classification after “Run Batch Classification” button is pressed and display a success/failure pop-up to user. This satisfies requirement C3.</w:t>
+      </w:r>
+    </w:p>
+    <w:p>
+      <w:pPr>
+        <w:ind w:left="0"/>
+        <w:rPr>
+          <w:sz w:val="24"/>
+          <w:szCs w:val="24"/>
+        </w:rPr>
+      </w:pPr>
+    </w:p>
+    <w:p>
+      <w:pPr>
+        <w:ind w:left="0"/>
+        <w:rPr>
+          <w:sz w:val="24"/>
+          <w:szCs w:val="24"/>
+        </w:rPr>
+      </w:pPr>
+      <w:r>
+        <w:rPr>
+          <w:sz w:val="24"/>
+          <w:szCs w:val="24"/>
+        </w:rPr>
+        <w:t>“Export Classifications to CSV” will download a CSV file containing each student’s classification for the specific programme, satisfying requirement C7.</w:t>
+      </w:r>
+    </w:p>
+    <w:p>
+      <w:pPr>
+        <w:ind w:left="0"/>
+        <w:rPr>
           <w:i/>
           <w:iCs/>
           <w:sz w:val="24"/>
           <w:szCs w:val="24"/>
         </w:rPr>
       </w:pPr>
-      <w:r>
+    </w:p>
+    <w:p>
+      <w:pPr>
+        <w:ind w:left="0"/>
         <w:rPr>
           <w:i/>
           <w:iCs/>
           <w:sz w:val="24"/>
           <w:szCs w:val="24"/>
         </w:rPr>
-        <w:t xml:space="preserve">Student Results </w:t>
-      </w:r>
-    </w:p>
-    <w:p>
-      <w:pPr>
-        <w:ind w:left="0"/>
+      </w:pPr>
+      <w:r>
         <w:rPr>
           <w:i/>
           <w:iCs/>
-          <w:sz w:val="24"/>
-          <w:szCs w:val="24"/>
-        </w:rPr>
-      </w:pPr>
+          <w:noProof/>
+          <w:sz w:val="24"/>
+          <w:szCs w:val="24"/>
+          <w14:ligatures w14:val="standardContextual"/>
+        </w:rPr>
+        <w:lastRenderedPageBreak/>
+        <mc:AlternateContent>
+          <mc:Choice Requires="wpg">
+            <w:drawing>
+              <wp:anchor distT="0" distB="0" distL="114300" distR="114300" simplePos="0" relativeHeight="251675648" behindDoc="1" locked="0" layoutInCell="1" allowOverlap="1" wp14:anchorId="79A2A11E" wp14:editId="79C4F5C2">
+                <wp:simplePos x="0" y="0"/>
+                <wp:positionH relativeFrom="margin">
+                  <wp:align>left</wp:align>
+                </wp:positionH>
+                <wp:positionV relativeFrom="paragraph">
+                  <wp:posOffset>319405</wp:posOffset>
+                </wp:positionV>
+                <wp:extent cx="6278880" cy="3279775"/>
+                <wp:effectExtent l="0" t="0" r="7620" b="0"/>
+                <wp:wrapTopAndBottom/>
+                <wp:docPr id="1907173203" name="Group 8"/>
+                <wp:cNvGraphicFramePr/>
+                <a:graphic xmlns:a="http://schemas.openxmlformats.org/drawingml/2006/main">
+                  <a:graphicData uri="http://schemas.microsoft.com/office/word/2010/wordprocessingGroup">
+                    <wpg:wgp>
+                      <wpg:cNvGrpSpPr/>
+                      <wpg:grpSpPr>
+                        <a:xfrm>
+                          <a:off x="0" y="0"/>
+                          <a:ext cx="6278880" cy="3279775"/>
+                          <a:chOff x="0" y="0"/>
+                          <a:chExt cx="6278880" cy="3279775"/>
+                        </a:xfrm>
+                      </wpg:grpSpPr>
+                      <pic:pic xmlns:pic="http://schemas.openxmlformats.org/drawingml/2006/picture">
+                        <pic:nvPicPr>
+                          <pic:cNvPr id="391691529" name="Picture 1"/>
+                          <pic:cNvPicPr>
+                            <a:picLocks noChangeAspect="1"/>
+                          </pic:cNvPicPr>
+                        </pic:nvPicPr>
+                        <pic:blipFill>
+                          <a:blip r:embed="rId26" cstate="print">
+                            <a:extLst>
+                              <a:ext uri="{28A0092B-C50C-407E-A947-70E740481C1C}">
+                                <a14:useLocalDpi xmlns:a14="http://schemas.microsoft.com/office/drawing/2010/main" val="0"/>
+                              </a:ext>
+                            </a:extLst>
+                          </a:blip>
+                          <a:stretch>
+                            <a:fillRect/>
+                          </a:stretch>
+                        </pic:blipFill>
+                        <pic:spPr>
+                          <a:xfrm>
+                            <a:off x="7620" y="0"/>
+                            <a:ext cx="6271260" cy="2929255"/>
+                          </a:xfrm>
+                          <a:prstGeom prst="rect">
+                            <a:avLst/>
+                          </a:prstGeom>
+                        </pic:spPr>
+                      </pic:pic>
+                      <wps:wsp>
+                        <wps:cNvPr id="701391944" name="Text Box 2"/>
+                        <wps:cNvSpPr txBox="1">
+                          <a:spLocks noChangeArrowheads="1"/>
+                        </wps:cNvSpPr>
+                        <wps:spPr bwMode="auto">
+                          <a:xfrm>
+                            <a:off x="0" y="2994660"/>
+                            <a:ext cx="6278880" cy="285115"/>
+                          </a:xfrm>
+                          <a:prstGeom prst="rect">
+                            <a:avLst/>
+                          </a:prstGeom>
+                          <a:noFill/>
+                          <a:ln w="9525">
+                            <a:noFill/>
+                            <a:miter lim="800000"/>
+                            <a:headEnd/>
+                            <a:tailEnd/>
+                          </a:ln>
+                        </wps:spPr>
+                        <wps:txbx>
+                          <w:txbxContent>
+                            <w:p>
+                              <w:pPr>
+                                <w:ind w:left="0"/>
+                                <w:rPr>
+                                  <w:i/>
+                                  <w:iCs/>
+                                </w:rPr>
+                              </w:pPr>
+                              <w:r>
+                                <w:rPr>
+                                  <w:b/>
+                                  <w:bCs/>
+                                </w:rPr>
+                                <w:t xml:space="preserve">Figure </w:t>
+                              </w:r>
+                              <w:r>
+                                <w:rPr>
+                                  <w:b/>
+                                  <w:bCs/>
+                                </w:rPr>
+                                <w:t>9</w:t>
+                              </w:r>
+                              <w:r>
+                                <w:rPr>
+                                  <w:b/>
+                                  <w:bCs/>
+                                </w:rPr>
+                                <w:t>.</w:t>
+                              </w:r>
+                              <w:r>
+                                <w:rPr>
+                                  <w:b/>
+                                  <w:bCs/>
+                                </w:rPr>
+                                <w:t>1</w:t>
+                              </w:r>
+                              <w:r>
+                                <w:rPr>
+                                  <w:b/>
+                                  <w:bCs/>
+                                </w:rPr>
+                                <w:t>.</w:t>
+                              </w:r>
+                              <w:r>
+                                <w:rPr>
+                                  <w:b/>
+                                  <w:bCs/>
+                                </w:rPr>
+                                <w:t xml:space="preserve"> </w:t>
+                              </w:r>
+                              <w:r>
+                                <w:t xml:space="preserve">Student </w:t>
+                              </w:r>
+                              <w:r>
+                                <w:t>Results (Top)</w:t>
+                              </w:r>
+                              <w:r>
+                                <w:t xml:space="preserve"> (</w:t>
+                              </w:r>
+                              <w:r>
+                                <w:rPr>
+                                  <w:i/>
+                                  <w:iCs/>
+                                </w:rPr>
+                                <w:t>“/officer/programme</w:t>
+                              </w:r>
+                              <w:proofErr w:type="gramStart"/>
+                              <w:r>
+                                <w:rPr>
+                                  <w:i/>
+                                  <w:iCs/>
+                                </w:rPr>
+                                <w:t>/:</w:t>
+                              </w:r>
+                              <w:proofErr w:type="spellStart"/>
+                              <w:r>
+                                <w:rPr>
+                                  <w:i/>
+                                  <w:iCs/>
+                                </w:rPr>
+                                <w:t>programmeId</w:t>
+                              </w:r>
+                              <w:proofErr w:type="spellEnd"/>
+                              <w:proofErr w:type="gramEnd"/>
+                              <w:r>
+                                <w:rPr>
+                                  <w:i/>
+                                  <w:iCs/>
+                                </w:rPr>
+                                <w:t>/student</w:t>
+                              </w:r>
+                              <w:proofErr w:type="gramStart"/>
+                              <w:r>
+                                <w:rPr>
+                                  <w:i/>
+                                  <w:iCs/>
+                                </w:rPr>
+                                <w:t>/:</w:t>
+                              </w:r>
+                              <w:proofErr w:type="spellStart"/>
+                              <w:r>
+                                <w:rPr>
+                                  <w:i/>
+                                  <w:iCs/>
+                                </w:rPr>
+                                <w:t>studentId</w:t>
+                              </w:r>
+                              <w:proofErr w:type="spellEnd"/>
+                              <w:proofErr w:type="gramEnd"/>
+                              <w:r>
+                                <w:rPr>
+                                  <w:i/>
+                                  <w:iCs/>
+                                </w:rPr>
+                                <w:t>/results</w:t>
+                              </w:r>
+                              <w:r>
+                                <w:rPr>
+                                  <w:i/>
+                                  <w:iCs/>
+                                </w:rPr>
+                                <w:t>”)</w:t>
+                              </w:r>
+                            </w:p>
+                          </w:txbxContent>
+                        </wps:txbx>
+                        <wps:bodyPr rot="0" vert="horz" wrap="square" lIns="91440" tIns="45720" rIns="91440" bIns="45720" anchor="t" anchorCtr="0">
+                          <a:spAutoFit/>
+                        </wps:bodyPr>
+                      </wps:wsp>
+                    </wpg:wgp>
+                  </a:graphicData>
+                </a:graphic>
+              </wp:anchor>
+            </w:drawing>
+          </mc:Choice>
+          <mc:Fallback>
+            <w:pict>
+              <v:group w14:anchorId="79A2A11E" id="Group 8" o:spid="_x0000_s1048" style="position:absolute;margin-left:0;margin-top:25.15pt;width:494.4pt;height:258.25pt;z-index:-251640832;mso-position-horizontal:left;mso-position-horizontal-relative:margin" coordsize="62788,32797" o:gfxdata="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">
+                <v:shape id="Picture 1" o:spid="_x0000_s1049" type="#_x0000_t75" style="position:absolute;left:76;width:62712;height:29292;visibility:visible;mso-wrap-style:square" o:gfxdata="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">
+                  <v:imagedata r:id="rId27" o:title=""/>
+                </v:shape>
+                <v:shape id="_x0000_s1050" type="#_x0000_t202" style="position:absolute;top:29946;width:62788;height:2851;visibility:visible;mso-wrap-style:square;v-text-anchor:top" o:gfxdata="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" filled="f" stroked="f">
+                  <v:textbox style="mso-fit-shape-to-text:t">
+                    <w:txbxContent>
+                      <w:p>
+                        <w:pPr>
+                          <w:ind w:left="0"/>
+                          <w:rPr>
+                            <w:i/>
+                            <w:iCs/>
+                          </w:rPr>
+                        </w:pPr>
+                        <w:r>
+                          <w:rPr>
+                            <w:b/>
+                            <w:bCs/>
+                          </w:rPr>
+                          <w:t xml:space="preserve">Figure </w:t>
+                        </w:r>
+                        <w:r>
+                          <w:rPr>
+                            <w:b/>
+                            <w:bCs/>
+                          </w:rPr>
+                          <w:t>9</w:t>
+                        </w:r>
+                        <w:r>
+                          <w:rPr>
+                            <w:b/>
+                            <w:bCs/>
+                          </w:rPr>
+                          <w:t>.</w:t>
+                        </w:r>
+                        <w:r>
+                          <w:rPr>
+                            <w:b/>
+                            <w:bCs/>
+                          </w:rPr>
+                          <w:t>1</w:t>
+                        </w:r>
+                        <w:r>
+                          <w:rPr>
+                            <w:b/>
+                            <w:bCs/>
+                          </w:rPr>
+                          <w:t>.</w:t>
+                        </w:r>
+                        <w:r>
+                          <w:rPr>
+                            <w:b/>
+                            <w:bCs/>
+                          </w:rPr>
+                          <w:t xml:space="preserve"> </w:t>
+                        </w:r>
+                        <w:r>
+                          <w:t xml:space="preserve">Student </w:t>
+                        </w:r>
+                        <w:r>
+                          <w:t>Results (Top)</w:t>
+                        </w:r>
+                        <w:r>
+                          <w:t xml:space="preserve"> (</w:t>
+                        </w:r>
+                        <w:r>
+                          <w:rPr>
+                            <w:i/>
+                            <w:iCs/>
+                          </w:rPr>
+                          <w:t>“/officer/programme</w:t>
+                        </w:r>
+                        <w:proofErr w:type="gramStart"/>
+                        <w:r>
+                          <w:rPr>
+                            <w:i/>
+                            <w:iCs/>
+                          </w:rPr>
+                          <w:t>/:</w:t>
+                        </w:r>
+                        <w:proofErr w:type="spellStart"/>
+                        <w:r>
+                          <w:rPr>
+                            <w:i/>
+                            <w:iCs/>
+                          </w:rPr>
+                          <w:t>programmeId</w:t>
+                        </w:r>
+                        <w:proofErr w:type="spellEnd"/>
+                        <w:proofErr w:type="gramEnd"/>
+                        <w:r>
+                          <w:rPr>
+                            <w:i/>
+                            <w:iCs/>
+                          </w:rPr>
+                          <w:t>/student</w:t>
+                        </w:r>
+                        <w:proofErr w:type="gramStart"/>
+                        <w:r>
+                          <w:rPr>
+                            <w:i/>
+                            <w:iCs/>
+                          </w:rPr>
+                          <w:t>/:</w:t>
+                        </w:r>
+                        <w:proofErr w:type="spellStart"/>
+                        <w:r>
+                          <w:rPr>
+                            <w:i/>
+                            <w:iCs/>
+                          </w:rPr>
+                          <w:t>studentId</w:t>
+                        </w:r>
+                        <w:proofErr w:type="spellEnd"/>
+                        <w:proofErr w:type="gramEnd"/>
+                        <w:r>
+                          <w:rPr>
+                            <w:i/>
+                            <w:iCs/>
+                          </w:rPr>
+                          <w:t>/results</w:t>
+                        </w:r>
+                        <w:r>
+                          <w:rPr>
+                            <w:i/>
+                            <w:iCs/>
+                          </w:rPr>
+                          <w:t>”)</w:t>
+                        </w:r>
+                      </w:p>
+                    </w:txbxContent>
+                  </v:textbox>
+                </v:shape>
+                <w10:wrap type="topAndBottom" anchorx="margin"/>
+              </v:group>
+            </w:pict>
+          </mc:Fallback>
+        </mc:AlternateContent>
+      </w:r>
       <w:r>
         <w:rPr>
           <w:i/>
@@ -2015,8 +3288,822 @@
           <w:sz w:val="24"/>
           <w:szCs w:val="24"/>
         </w:rPr>
+        <w:t xml:space="preserve">Student Results </w:t>
+      </w:r>
+      <w:r>
+        <w:rPr>
+          <w:i/>
+          <w:iCs/>
+          <w:noProof/>
+          <w:sz w:val="24"/>
+          <w:szCs w:val="24"/>
+          <w14:ligatures w14:val="standardContextual"/>
+        </w:rPr>
+        <mc:AlternateContent>
+          <mc:Choice Requires="wpg">
+            <w:drawing>
+              <wp:anchor distT="0" distB="0" distL="114300" distR="114300" simplePos="0" relativeHeight="251679744" behindDoc="1" locked="0" layoutInCell="1" allowOverlap="1" wp14:anchorId="078762E9" wp14:editId="0816A696">
+                <wp:simplePos x="0" y="0"/>
+                <wp:positionH relativeFrom="column">
+                  <wp:posOffset>109220</wp:posOffset>
+                </wp:positionH>
+                <wp:positionV relativeFrom="paragraph">
+                  <wp:posOffset>3608070</wp:posOffset>
+                </wp:positionV>
+                <wp:extent cx="5739130" cy="3014980"/>
+                <wp:effectExtent l="0" t="0" r="0" b="0"/>
+                <wp:wrapTopAndBottom/>
+                <wp:docPr id="1836368247" name="Group 9"/>
+                <wp:cNvGraphicFramePr/>
+                <a:graphic xmlns:a="http://schemas.openxmlformats.org/drawingml/2006/main">
+                  <a:graphicData uri="http://schemas.microsoft.com/office/word/2010/wordprocessingGroup">
+                    <wpg:wgp>
+                      <wpg:cNvGrpSpPr/>
+                      <wpg:grpSpPr>
+                        <a:xfrm>
+                          <a:off x="0" y="0"/>
+                          <a:ext cx="5739130" cy="3014980"/>
+                          <a:chOff x="0" y="0"/>
+                          <a:chExt cx="5739764" cy="3015614"/>
+                        </a:xfrm>
+                      </wpg:grpSpPr>
+                      <pic:pic xmlns:pic="http://schemas.openxmlformats.org/drawingml/2006/picture">
+                        <pic:nvPicPr>
+                          <pic:cNvPr id="1914657637" name="Picture 1"/>
+                          <pic:cNvPicPr>
+                            <a:picLocks noChangeAspect="1"/>
+                          </pic:cNvPicPr>
+                        </pic:nvPicPr>
+                        <pic:blipFill>
+                          <a:blip r:embed="rId28" cstate="print">
+                            <a:extLst>
+                              <a:ext uri="{28A0092B-C50C-407E-A947-70E740481C1C}">
+                                <a14:useLocalDpi xmlns:a14="http://schemas.microsoft.com/office/drawing/2010/main" val="0"/>
+                              </a:ext>
+                            </a:extLst>
+                          </a:blip>
+                          <a:stretch>
+                            <a:fillRect/>
+                          </a:stretch>
+                        </pic:blipFill>
+                        <pic:spPr>
+                          <a:xfrm>
+                            <a:off x="7620" y="0"/>
+                            <a:ext cx="5731510" cy="2543175"/>
+                          </a:xfrm>
+                          <a:prstGeom prst="rect">
+                            <a:avLst/>
+                          </a:prstGeom>
+                        </pic:spPr>
+                      </pic:pic>
+                      <wps:wsp>
+                        <wps:cNvPr id="739199848" name="Text Box 2"/>
+                        <wps:cNvSpPr txBox="1">
+                          <a:spLocks noChangeArrowheads="1"/>
+                        </wps:cNvSpPr>
+                        <wps:spPr bwMode="auto">
+                          <a:xfrm>
+                            <a:off x="0" y="2545080"/>
+                            <a:ext cx="5739764" cy="470534"/>
+                          </a:xfrm>
+                          <a:prstGeom prst="rect">
+                            <a:avLst/>
+                          </a:prstGeom>
+                          <a:noFill/>
+                          <a:ln w="9525">
+                            <a:noFill/>
+                            <a:miter lim="800000"/>
+                            <a:headEnd/>
+                            <a:tailEnd/>
+                          </a:ln>
+                        </wps:spPr>
+                        <wps:txbx>
+                          <w:txbxContent>
+                            <w:p>
+                              <w:pPr>
+                                <w:ind w:left="0"/>
+                                <w:rPr>
+                                  <w:i/>
+                                  <w:iCs/>
+                                </w:rPr>
+                              </w:pPr>
+                              <w:r>
+                                <w:rPr>
+                                  <w:b/>
+                                  <w:bCs/>
+                                </w:rPr>
+                                <w:t xml:space="preserve">Figure </w:t>
+                              </w:r>
+                              <w:r>
+                                <w:rPr>
+                                  <w:b/>
+                                  <w:bCs/>
+                                </w:rPr>
+                                <w:t>9</w:t>
+                              </w:r>
+                              <w:r>
+                                <w:rPr>
+                                  <w:b/>
+                                  <w:bCs/>
+                                </w:rPr>
+                                <w:t>.</w:t>
+                              </w:r>
+                              <w:r>
+                                <w:rPr>
+                                  <w:b/>
+                                  <w:bCs/>
+                                </w:rPr>
+                                <w:t>2</w:t>
+                              </w:r>
+                              <w:r>
+                                <w:rPr>
+                                  <w:b/>
+                                  <w:bCs/>
+                                </w:rPr>
+                                <w:t>.</w:t>
+                              </w:r>
+                              <w:r>
+                                <w:rPr>
+                                  <w:b/>
+                                  <w:bCs/>
+                                </w:rPr>
+                                <w:t xml:space="preserve"> </w:t>
+                              </w:r>
+                              <w:r>
+                                <w:t>Student Results (</w:t>
+                              </w:r>
+                              <w:r>
+                                <w:t>Bottom</w:t>
+                              </w:r>
+                              <w:r>
+                                <w:t>) (</w:t>
+                              </w:r>
+                              <w:r>
+                                <w:rPr>
+                                  <w:i/>
+                                  <w:iCs/>
+                                </w:rPr>
+                                <w:t>“/officer/programme</w:t>
+                              </w:r>
+                              <w:proofErr w:type="gramStart"/>
+                              <w:r>
+                                <w:rPr>
+                                  <w:i/>
+                                  <w:iCs/>
+                                </w:rPr>
+                                <w:t>/:</w:t>
+                              </w:r>
+                              <w:proofErr w:type="spellStart"/>
+                              <w:r>
+                                <w:rPr>
+                                  <w:i/>
+                                  <w:iCs/>
+                                </w:rPr>
+                                <w:t>programmeId</w:t>
+                              </w:r>
+                              <w:proofErr w:type="spellEnd"/>
+                              <w:proofErr w:type="gramEnd"/>
+                              <w:r>
+                                <w:rPr>
+                                  <w:i/>
+                                  <w:iCs/>
+                                </w:rPr>
+                                <w:t>/student</w:t>
+                              </w:r>
+                              <w:proofErr w:type="gramStart"/>
+                              <w:r>
+                                <w:rPr>
+                                  <w:i/>
+                                  <w:iCs/>
+                                </w:rPr>
+                                <w:t>/:</w:t>
+                              </w:r>
+                              <w:proofErr w:type="spellStart"/>
+                              <w:r>
+                                <w:rPr>
+                                  <w:i/>
+                                  <w:iCs/>
+                                </w:rPr>
+                                <w:t>studentId</w:t>
+                              </w:r>
+                              <w:proofErr w:type="spellEnd"/>
+                              <w:proofErr w:type="gramEnd"/>
+                              <w:r>
+                                <w:rPr>
+                                  <w:i/>
+                                  <w:iCs/>
+                                </w:rPr>
+                                <w:t>/results”)</w:t>
+                              </w:r>
+                            </w:p>
+                          </w:txbxContent>
+                        </wps:txbx>
+                        <wps:bodyPr rot="0" vert="horz" wrap="square" lIns="91440" tIns="45720" rIns="91440" bIns="45720" anchor="t" anchorCtr="0">
+                          <a:spAutoFit/>
+                        </wps:bodyPr>
+                      </wps:wsp>
+                    </wpg:wgp>
+                  </a:graphicData>
+                </a:graphic>
+              </wp:anchor>
+            </w:drawing>
+          </mc:Choice>
+          <mc:Fallback>
+            <w:pict>
+              <v:group w14:anchorId="078762E9" id="Group 9" o:spid="_x0000_s1051" style="position:absolute;margin-left:8.6pt;margin-top:284.1pt;width:451.9pt;height:237.4pt;z-index:-251636736" coordsize="57397,30156" o:gfxdata="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">
+                <v:shape id="Picture 1" o:spid="_x0000_s1052" type="#_x0000_t75" style="position:absolute;left:76;width:57315;height:25431;visibility:visible;mso-wrap-style:square" o:gfxdata="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">
+                  <v:imagedata r:id="rId29" o:title=""/>
+                </v:shape>
+                <v:shape id="_x0000_s1053" type="#_x0000_t202" style="position:absolute;top:25450;width:57397;height:4706;visibility:visible;mso-wrap-style:square;v-text-anchor:top" o:gfxdata="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" filled="f" stroked="f">
+                  <v:textbox style="mso-fit-shape-to-text:t">
+                    <w:txbxContent>
+                      <w:p>
+                        <w:pPr>
+                          <w:ind w:left="0"/>
+                          <w:rPr>
+                            <w:i/>
+                            <w:iCs/>
+                          </w:rPr>
+                        </w:pPr>
+                        <w:r>
+                          <w:rPr>
+                            <w:b/>
+                            <w:bCs/>
+                          </w:rPr>
+                          <w:t xml:space="preserve">Figure </w:t>
+                        </w:r>
+                        <w:r>
+                          <w:rPr>
+                            <w:b/>
+                            <w:bCs/>
+                          </w:rPr>
+                          <w:t>9</w:t>
+                        </w:r>
+                        <w:r>
+                          <w:rPr>
+                            <w:b/>
+                            <w:bCs/>
+                          </w:rPr>
+                          <w:t>.</w:t>
+                        </w:r>
+                        <w:r>
+                          <w:rPr>
+                            <w:b/>
+                            <w:bCs/>
+                          </w:rPr>
+                          <w:t>2</w:t>
+                        </w:r>
+                        <w:r>
+                          <w:rPr>
+                            <w:b/>
+                            <w:bCs/>
+                          </w:rPr>
+                          <w:t>.</w:t>
+                        </w:r>
+                        <w:r>
+                          <w:rPr>
+                            <w:b/>
+                            <w:bCs/>
+                          </w:rPr>
+                          <w:t xml:space="preserve"> </w:t>
+                        </w:r>
+                        <w:r>
+                          <w:t>Student Results (</w:t>
+                        </w:r>
+                        <w:r>
+                          <w:t>Bottom</w:t>
+                        </w:r>
+                        <w:r>
+                          <w:t>) (</w:t>
+                        </w:r>
+                        <w:r>
+                          <w:rPr>
+                            <w:i/>
+                            <w:iCs/>
+                          </w:rPr>
+                          <w:t>“/officer/programme</w:t>
+                        </w:r>
+                        <w:proofErr w:type="gramStart"/>
+                        <w:r>
+                          <w:rPr>
+                            <w:i/>
+                            <w:iCs/>
+                          </w:rPr>
+                          <w:t>/:</w:t>
+                        </w:r>
+                        <w:proofErr w:type="spellStart"/>
+                        <w:r>
+                          <w:rPr>
+                            <w:i/>
+                            <w:iCs/>
+                          </w:rPr>
+                          <w:t>programmeId</w:t>
+                        </w:r>
+                        <w:proofErr w:type="spellEnd"/>
+                        <w:proofErr w:type="gramEnd"/>
+                        <w:r>
+                          <w:rPr>
+                            <w:i/>
+                            <w:iCs/>
+                          </w:rPr>
+                          <w:t>/student</w:t>
+                        </w:r>
+                        <w:proofErr w:type="gramStart"/>
+                        <w:r>
+                          <w:rPr>
+                            <w:i/>
+                            <w:iCs/>
+                          </w:rPr>
+                          <w:t>/:</w:t>
+                        </w:r>
+                        <w:proofErr w:type="spellStart"/>
+                        <w:r>
+                          <w:rPr>
+                            <w:i/>
+                            <w:iCs/>
+                          </w:rPr>
+                          <w:t>studentId</w:t>
+                        </w:r>
+                        <w:proofErr w:type="spellEnd"/>
+                        <w:proofErr w:type="gramEnd"/>
+                        <w:r>
+                          <w:rPr>
+                            <w:i/>
+                            <w:iCs/>
+                          </w:rPr>
+                          <w:t>/results”)</w:t>
+                        </w:r>
+                      </w:p>
+                    </w:txbxContent>
+                  </v:textbox>
+                </v:shape>
+                <w10:wrap type="topAndBottom"/>
+              </v:group>
+            </w:pict>
+          </mc:Fallback>
+        </mc:AlternateContent>
+      </w:r>
+    </w:p>
+    <w:p>
+      <w:pPr>
+        <w:ind w:left="0"/>
+        <w:rPr>
+          <w:sz w:val="24"/>
+          <w:szCs w:val="24"/>
+        </w:rPr>
+      </w:pPr>
+      <w:r>
+        <w:rPr>
+          <w:sz w:val="24"/>
+          <w:szCs w:val="24"/>
+        </w:rPr>
+        <w:t>The student results page (shown in Figure 9.1) will display student information and allow officer to edit this information if necessary and enable the officer to export the individual student’s results to a CSV file (again satisfying requirement C7).</w:t>
+      </w:r>
+    </w:p>
+    <w:p>
+      <w:pPr>
+        <w:ind w:left="0"/>
+        <w:rPr>
+          <w:sz w:val="24"/>
+          <w:szCs w:val="24"/>
+        </w:rPr>
+      </w:pPr>
+    </w:p>
+    <w:p>
+      <w:pPr>
+        <w:ind w:left="0"/>
+        <w:rPr>
+          <w:sz w:val="24"/>
+          <w:szCs w:val="24"/>
+        </w:rPr>
+      </w:pPr>
+      <w:r>
+        <w:rPr>
+          <w:sz w:val="24"/>
+          <w:szCs w:val="24"/>
+        </w:rPr>
+        <w:t>This page will show the student’s results for each academic year they have completed, along with their total credits for that year and their average for that year.</w:t>
+      </w:r>
+      <w:r>
+        <w:rPr>
+          <w:sz w:val="24"/>
+          <w:szCs w:val="24"/>
+        </w:rPr>
+        <w:t xml:space="preserve"> Officer may also add a result or edit/delete a particular result. </w:t>
+      </w:r>
+    </w:p>
+    <w:p>
+      <w:pPr>
+        <w:ind w:left="0"/>
+        <w:rPr>
+          <w:sz w:val="24"/>
+          <w:szCs w:val="24"/>
+        </w:rPr>
+      </w:pPr>
+      <w:r>
+        <w:rPr>
+          <w:sz w:val="24"/>
+          <w:szCs w:val="24"/>
+        </w:rPr>
+        <w:t>Note the use of capped mark as requirement C8, as resits will be capped at passing mark of 40.</w:t>
+      </w:r>
+    </w:p>
+    <w:p>
+      <w:pPr>
+        <w:ind w:left="0"/>
+        <w:rPr>
+          <w:sz w:val="24"/>
+          <w:szCs w:val="24"/>
+        </w:rPr>
+      </w:pPr>
+    </w:p>
+    <w:p>
+      <w:pPr>
+        <w:ind w:left="0"/>
+        <w:rPr>
+          <w:sz w:val="24"/>
+          <w:szCs w:val="24"/>
+        </w:rPr>
+      </w:pPr>
+      <w:r>
+        <w:rPr>
+          <w:sz w:val="24"/>
+          <w:szCs w:val="24"/>
+        </w:rPr>
+        <w:lastRenderedPageBreak/>
+        <w:t>Following batch classification, the results page will display the proposed classification generated by the system, as shown in Figure 9.2. Officer will then be able to approve classification or override the decision. This section satisfies requirements C4, C5 and D6.</w:t>
+      </w:r>
+    </w:p>
+    <w:p>
+      <w:pPr>
+        <w:ind w:left="0"/>
+        <w:rPr>
+          <w:sz w:val="24"/>
+          <w:szCs w:val="24"/>
+        </w:rPr>
+      </w:pPr>
+    </w:p>
+    <w:p>
+      <w:pPr>
+        <w:ind w:left="0"/>
+        <w:rPr>
+          <w:sz w:val="24"/>
+          <w:szCs w:val="24"/>
+        </w:rPr>
+      </w:pPr>
+    </w:p>
+    <w:p>
+      <w:pPr>
+        <w:ind w:left="0"/>
+        <w:rPr>
+          <w:i/>
+          <w:iCs/>
+          <w:sz w:val="24"/>
+          <w:szCs w:val="24"/>
+        </w:rPr>
+      </w:pPr>
+      <w:r>
+        <w:rPr>
+          <w:i/>
+          <w:iCs/>
+          <w:sz w:val="24"/>
+          <w:szCs w:val="24"/>
+        </w:rPr>
         <w:t>Programme Statistics</w:t>
       </w:r>
+    </w:p>
+    <w:p>
+      <w:pPr>
+        <w:ind w:left="0"/>
+        <w:rPr>
+          <w:sz w:val="24"/>
+          <w:szCs w:val="24"/>
+        </w:rPr>
+      </w:pPr>
+      <w:r>
+        <w:rPr>
+          <w:i/>
+          <w:iCs/>
+          <w:noProof/>
+          <w:sz w:val="24"/>
+          <w:szCs w:val="24"/>
+          <w14:ligatures w14:val="standardContextual"/>
+        </w:rPr>
+        <mc:AlternateContent>
+          <mc:Choice Requires="wpg">
+            <w:drawing>
+              <wp:anchor distT="0" distB="0" distL="114300" distR="114300" simplePos="0" relativeHeight="251683840" behindDoc="1" locked="0" layoutInCell="1" allowOverlap="1" wp14:anchorId="2CA8A4EC" wp14:editId="77E8D657">
+                <wp:simplePos x="0" y="0"/>
+                <wp:positionH relativeFrom="margin">
+                  <wp:align>right</wp:align>
+                </wp:positionH>
+                <wp:positionV relativeFrom="paragraph">
+                  <wp:posOffset>263</wp:posOffset>
+                </wp:positionV>
+                <wp:extent cx="5328920" cy="2785110"/>
+                <wp:effectExtent l="0" t="0" r="5080" b="0"/>
+                <wp:wrapTopAndBottom/>
+                <wp:docPr id="1194662459" name="Group 10"/>
+                <wp:cNvGraphicFramePr/>
+                <a:graphic xmlns:a="http://schemas.openxmlformats.org/drawingml/2006/main">
+                  <a:graphicData uri="http://schemas.microsoft.com/office/word/2010/wordprocessingGroup">
+                    <wpg:wgp>
+                      <wpg:cNvGrpSpPr/>
+                      <wpg:grpSpPr>
+                        <a:xfrm>
+                          <a:off x="0" y="24533"/>
+                          <a:ext cx="5328920" cy="2760577"/>
+                          <a:chOff x="0" y="26274"/>
+                          <a:chExt cx="5739764" cy="2956499"/>
+                        </a:xfrm>
+                      </wpg:grpSpPr>
+                      <pic:pic xmlns:pic="http://schemas.openxmlformats.org/drawingml/2006/picture">
+                        <pic:nvPicPr>
+                          <pic:cNvPr id="851527251" name="Picture 1"/>
+                          <pic:cNvPicPr>
+                            <a:picLocks noChangeAspect="1"/>
+                          </pic:cNvPicPr>
+                        </pic:nvPicPr>
+                        <pic:blipFill>
+                          <a:blip r:embed="rId30" cstate="print">
+                            <a:extLst>
+                              <a:ext uri="{28A0092B-C50C-407E-A947-70E740481C1C}">
+                                <a14:useLocalDpi xmlns:a14="http://schemas.microsoft.com/office/drawing/2010/main" val="0"/>
+                              </a:ext>
+                            </a:extLst>
+                          </a:blip>
+                          <a:srcRect/>
+                          <a:stretch/>
+                        </pic:blipFill>
+                        <pic:spPr>
+                          <a:xfrm>
+                            <a:off x="0" y="26274"/>
+                            <a:ext cx="5731510" cy="2644296"/>
+                          </a:xfrm>
+                          <a:prstGeom prst="rect">
+                            <a:avLst/>
+                          </a:prstGeom>
+                        </pic:spPr>
+                      </pic:pic>
+                      <wps:wsp>
+                        <wps:cNvPr id="2053828720" name="Text Box 2"/>
+                        <wps:cNvSpPr txBox="1">
+                          <a:spLocks noChangeArrowheads="1"/>
+                        </wps:cNvSpPr>
+                        <wps:spPr bwMode="auto">
+                          <a:xfrm>
+                            <a:off x="0" y="2697024"/>
+                            <a:ext cx="5739764" cy="285749"/>
+                          </a:xfrm>
+                          <a:prstGeom prst="rect">
+                            <a:avLst/>
+                          </a:prstGeom>
+                          <a:noFill/>
+                          <a:ln w="9525">
+                            <a:noFill/>
+                            <a:miter lim="800000"/>
+                            <a:headEnd/>
+                            <a:tailEnd/>
+                          </a:ln>
+                        </wps:spPr>
+                        <wps:txbx>
+                          <w:txbxContent>
+                            <w:p>
+                              <w:pPr>
+                                <w:ind w:left="0"/>
+                                <w:rPr>
+                                  <w:i/>
+                                  <w:iCs/>
+                                </w:rPr>
+                              </w:pPr>
+                              <w:r>
+                                <w:rPr>
+                                  <w:b/>
+                                  <w:bCs/>
+                                </w:rPr>
+                                <w:t xml:space="preserve">Figure </w:t>
+                              </w:r>
+                              <w:r>
+                                <w:rPr>
+                                  <w:b/>
+                                  <w:bCs/>
+                                </w:rPr>
+                                <w:t>10.</w:t>
+                              </w:r>
+                              <w:r>
+                                <w:rPr>
+                                  <w:b/>
+                                  <w:bCs/>
+                                </w:rPr>
+                                <w:t xml:space="preserve"> </w:t>
+                              </w:r>
+                              <w:r>
+                                <w:t xml:space="preserve">Programme Statistics </w:t>
+                              </w:r>
+                              <w:r>
+                                <w:t>(</w:t>
+                              </w:r>
+                              <w:r>
+                                <w:rPr>
+                                  <w:i/>
+                                  <w:iCs/>
+                                </w:rPr>
+                                <w:t>“/officer/</w:t>
+                              </w:r>
+                              <w:r>
+                                <w:rPr>
+                                  <w:i/>
+                                  <w:iCs/>
+                                </w:rPr>
+                                <w:t>statistics</w:t>
+                              </w:r>
+                              <w:proofErr w:type="gramStart"/>
+                              <w:r>
+                                <w:rPr>
+                                  <w:i/>
+                                  <w:iCs/>
+                                </w:rPr>
+                                <w:t>/:</w:t>
+                              </w:r>
+                              <w:proofErr w:type="spellStart"/>
+                              <w:r>
+                                <w:rPr>
+                                  <w:i/>
+                                  <w:iCs/>
+                                </w:rPr>
+                                <w:t>programmeId</w:t>
+                              </w:r>
+                              <w:proofErr w:type="spellEnd"/>
+                              <w:proofErr w:type="gramEnd"/>
+                              <w:r>
+                                <w:rPr>
+                                  <w:i/>
+                                  <w:iCs/>
+                                </w:rPr>
+                                <w:t>”)</w:t>
+                              </w:r>
+                            </w:p>
+                          </w:txbxContent>
+                        </wps:txbx>
+                        <wps:bodyPr rot="0" vert="horz" wrap="square" lIns="91440" tIns="45720" rIns="91440" bIns="45720" anchor="t" anchorCtr="0">
+                          <a:noAutofit/>
+                        </wps:bodyPr>
+                      </wps:wsp>
+                    </wpg:wgp>
+                  </a:graphicData>
+                </a:graphic>
+                <wp14:sizeRelH relativeFrom="margin">
+                  <wp14:pctWidth>0</wp14:pctWidth>
+                </wp14:sizeRelH>
+                <wp14:sizeRelV relativeFrom="margin">
+                  <wp14:pctHeight>0</wp14:pctHeight>
+                </wp14:sizeRelV>
+              </wp:anchor>
+            </w:drawing>
+          </mc:Choice>
+          <mc:Fallback>
+            <w:pict>
+              <v:group w14:anchorId="2CA8A4EC" id="Group 10" o:spid="_x0000_s1054" style="position:absolute;margin-left:368.4pt;margin-top:0;width:419.6pt;height:219.3pt;z-index:-251632640;mso-position-horizontal:right;mso-position-horizontal-relative:margin;mso-width-relative:margin;mso-height-relative:margin" coordorigin=",262" coordsize="57397,29564" o:gfxdata="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">
+                <v:shape id="Picture 1" o:spid="_x0000_s1055" type="#_x0000_t75" style="position:absolute;top:262;width:57315;height:26443;visibility:visible;mso-wrap-style:square" o:gfxdata="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">
+                  <v:imagedata r:id="rId31" o:title=""/>
+                </v:shape>
+                <v:shape id="_x0000_s1056" type="#_x0000_t202" style="position:absolute;top:26970;width:57397;height:2857;visibility:visible;mso-wrap-style:square;v-text-anchor:top" o:gfxdata="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" filled="f" stroked="f">
+                  <v:textbox>
+                    <w:txbxContent>
+                      <w:p>
+                        <w:pPr>
+                          <w:ind w:left="0"/>
+                          <w:rPr>
+                            <w:i/>
+                            <w:iCs/>
+                          </w:rPr>
+                        </w:pPr>
+                        <w:r>
+                          <w:rPr>
+                            <w:b/>
+                            <w:bCs/>
+                          </w:rPr>
+                          <w:t xml:space="preserve">Figure </w:t>
+                        </w:r>
+                        <w:r>
+                          <w:rPr>
+                            <w:b/>
+                            <w:bCs/>
+                          </w:rPr>
+                          <w:t>10.</w:t>
+                        </w:r>
+                        <w:r>
+                          <w:rPr>
+                            <w:b/>
+                            <w:bCs/>
+                          </w:rPr>
+                          <w:t xml:space="preserve"> </w:t>
+                        </w:r>
+                        <w:r>
+                          <w:t xml:space="preserve">Programme Statistics </w:t>
+                        </w:r>
+                        <w:r>
+                          <w:t>(</w:t>
+                        </w:r>
+                        <w:r>
+                          <w:rPr>
+                            <w:i/>
+                            <w:iCs/>
+                          </w:rPr>
+                          <w:t>“/officer/</w:t>
+                        </w:r>
+                        <w:r>
+                          <w:rPr>
+                            <w:i/>
+                            <w:iCs/>
+                          </w:rPr>
+                          <w:t>statistics</w:t>
+                        </w:r>
+                        <w:proofErr w:type="gramStart"/>
+                        <w:r>
+                          <w:rPr>
+                            <w:i/>
+                            <w:iCs/>
+                          </w:rPr>
+                          <w:t>/:</w:t>
+                        </w:r>
+                        <w:proofErr w:type="spellStart"/>
+                        <w:r>
+                          <w:rPr>
+                            <w:i/>
+                            <w:iCs/>
+                          </w:rPr>
+                          <w:t>programmeId</w:t>
+                        </w:r>
+                        <w:proofErr w:type="spellEnd"/>
+                        <w:proofErr w:type="gramEnd"/>
+                        <w:r>
+                          <w:rPr>
+                            <w:i/>
+                            <w:iCs/>
+                          </w:rPr>
+                          <w:t>”)</w:t>
+                        </w:r>
+                      </w:p>
+                    </w:txbxContent>
+                  </v:textbox>
+                </v:shape>
+                <w10:wrap type="topAndBottom" anchorx="margin"/>
+              </v:group>
+            </w:pict>
+          </mc:Fallback>
+        </mc:AlternateContent>
+      </w:r>
+      <w:r>
+        <w:rPr>
+          <w:sz w:val="24"/>
+          <w:szCs w:val="24"/>
+        </w:rPr>
+        <w:t>Figure 10 shows programme statistics, which shows the student count, number of students classified, how many students have been flagged for review, and how many students have been approved.</w:t>
+      </w:r>
+    </w:p>
+    <w:p>
+      <w:pPr>
+        <w:ind w:left="0"/>
+        <w:rPr>
+          <w:sz w:val="24"/>
+          <w:szCs w:val="24"/>
+        </w:rPr>
+      </w:pPr>
+    </w:p>
+    <w:p>
+      <w:pPr>
+        <w:ind w:left="0"/>
+        <w:rPr>
+          <w:sz w:val="24"/>
+          <w:szCs w:val="24"/>
+        </w:rPr>
+      </w:pPr>
+      <w:r>
+        <w:rPr>
+          <w:sz w:val="24"/>
+          <w:szCs w:val="24"/>
+        </w:rPr>
+        <w:t>Chart.js was used to generate two statistical charts, a bar chart showing the classification distribution, and a doughnut chart showing the classification approval status.</w:t>
+      </w:r>
+    </w:p>
+    <w:p>
+      <w:pPr>
+        <w:ind w:left="0"/>
+        <w:rPr>
+          <w:sz w:val="24"/>
+          <w:szCs w:val="24"/>
+        </w:rPr>
+      </w:pPr>
+    </w:p>
+    <w:p>
+      <w:pPr>
+        <w:ind w:left="0"/>
+        <w:rPr>
+          <w:sz w:val="24"/>
+          <w:szCs w:val="24"/>
+        </w:rPr>
+      </w:pPr>
     </w:p>
     <w:sectPr>
       <w:pgSz w:w="11906" w:h="16838"/>
@@ -3223,6 +5310,7 @@
   <w:style w:type="character" w:default="1" w:styleId="DefaultParagraphFont">
     <w:name w:val="Default Paragraph Font"/>
     <w:uiPriority w:val="1"/>
+    <w:semiHidden/>
     <w:unhideWhenUsed/>
   </w:style>
   <w:style w:type="table" w:default="1" w:styleId="TableNormal">
@@ -3411,6 +5499,7 @@
       <w:numPr>
         <w:ilvl w:val="1"/>
       </w:numPr>
+      <w:ind w:left="1440"/>
     </w:pPr>
     <w:rPr>
       <w:rFonts w:eastAsiaTheme="majorEastAsia" w:cstheme="majorBidi"/>

</xml_diff>